<commit_message>
Docs: refresh Database Schema and Technical Design & Architecture
- Database Schema: document NotificationGroups, NotificationGroupUsers (join),
  and ScheduledReports tables (columns, keys, FKs, indexes); update relationships
  and index notes.
- Technical Design: EmailDispatcher provider chain (Graph > SMTP > Database Mail,
  attachments via Graph/SMTP), ScheduledReportRunner hosted service, Notification
  Groups, break-glass PBKDF2 secret store, and the registration-disabled /
  Secure-cookie / HSTS security controls.

Co-Authored-By: Claude Opus 4.8 <noreply@anthropic.com>
Claude-Session: https://claude.ai/code/session_01Bv28UYjCv2nEkbFMC2MiqD
</commit_message>
<xml_diff>
--- a/docs/word/Supplier Portal - Database Schema.docx
+++ b/docs/word/Supplier Portal - Database Schema.docx
@@ -414,7 +414,7 @@
                 <w:sz w:val="18"/>
                 <w:szCs w:val="18"/>
               </w:rPr>
-              <w:t xml:space="preserve">15 September 2026</w:t>
+              <w:t xml:space="preserve">17 September 2026</w:t>
             </w:r>
           </w:p>
         </w:tc>
@@ -492,7 +492,7 @@
           <w:sz w:val="21"/>
           <w:szCs w:val="21"/>
         </w:rPr>
-        <w:t xml:space="preserve">This document describes the Supplier Portal data model only. The Supplier Portal persists data in Microsoft SQL Server (on-premises) or Azure SQL Database, accessed through Entity Framework Core 8 using the DbContextFactory pattern. The supplier, user and master-data schema lives in ApplicationDbContext (default dbo schema).</w:t>
+        <w:t xml:space="preserve">This document describes the Supplier Portal data model only. The Supplier Portal persists data in Microsoft SQL Server (on-premises) or Azure SQL Database, accessed through Entity Framework Core 8 using the DbContextFactory pattern. The supplier, user, master-data, notification-group and scheduled-report schema all lives in ApplicationDbContext (default dbo schema). EF Core migrations are hand-written and applied at startup.</w:t>
       </w:r>
     </w:p>
     <w:p>
@@ -8982,7 +8982,2652 @@
           <w:sz w:val="30"/>
           <w:szCs w:val="30"/>
         </w:rPr>
-        <w:t xml:space="preserve">4. Relationships Summary</w:t>
+        <w:t xml:space="preserve">4. Notifications &amp; Scheduled Reporting (dbo)</w:t>
+      </w:r>
+    </w:p>
+    <w:p>
+      <w:pPr>
+        <w:pStyle w:val="Heading2"/>
+        <w:spacing w:after="90" w:before="200"/>
+      </w:pPr>
+      <w:r>
+        <w:rPr>
+          <w:rFonts w:ascii="Calibri" w:cs="Calibri" w:eastAsia="Calibri" w:hAnsi="Calibri"/>
+          <w:b/>
+          <w:bCs/>
+          <w:color w:val="274A7D"/>
+          <w:sz w:val="25"/>
+          <w:szCs w:val="25"/>
+        </w:rPr>
+        <w:t xml:space="preserve">4.1 NotificationGroup</w:t>
+      </w:r>
+    </w:p>
+    <w:p>
+      <w:pPr>
+        <w:spacing w:after="120" w:line="276"/>
+      </w:pPr>
+      <w:r>
+        <w:rPr>
+          <w:rFonts w:ascii="Calibri" w:cs="Calibri" w:eastAsia="Calibri" w:hAnsi="Calibri"/>
+          <w:sz w:val="21"/>
+          <w:szCs w:val="21"/>
+        </w:rPr>
+        <w:t xml:space="preserve">A named recipient list (e.g. ALL_USERS) used to address notifications and scheduled reports. Membership is a many-to-many with User through the NotificationGroupUsers join table.</w:t>
+      </w:r>
+    </w:p>
+    <w:tbl>
+      <w:tblPr>
+        <w:tblW w:type="dxa" w:w="9500"/>
+        <w:tblBorders>
+          <w:top w:val="single" w:color="D3DAE6" w:sz="4"/>
+          <w:left w:val="single" w:color="D3DAE6" w:sz="4"/>
+          <w:bottom w:val="single" w:color="D3DAE6" w:sz="4"/>
+          <w:right w:val="single" w:color="D3DAE6" w:sz="4"/>
+          <w:insideH w:val="single" w:color="D3DAE6" w:sz="4"/>
+          <w:insideV w:val="single" w:color="D3DAE6" w:sz="4"/>
+        </w:tblBorders>
+      </w:tblPr>
+      <w:tblGrid>
+        <w:gridCol w:w="3400"/>
+        <w:gridCol w:w="2100"/>
+        <w:gridCol w:w="1900"/>
+        <w:gridCol w:w="2100"/>
+      </w:tblGrid>
+      <w:tr>
+        <w:trPr>
+          <w:tblHeader/>
+        </w:trPr>
+        <w:tc>
+          <w:tcPr>
+            <w:tcW w:type="dxa" w:w="3400"/>
+            <w:shd w:fill="0B2545" w:color="auto" w:val="clear"/>
+            <w:tcMar>
+              <w:top w:type="dxa" w:w="40"/>
+              <w:left w:type="dxa" w:w="70"/>
+              <w:bottom w:type="dxa" w:w="40"/>
+              <w:right w:type="dxa" w:w="70"/>
+            </w:tcMar>
+          </w:tcPr>
+          <w:p>
+            <w:pPr>
+              <w:spacing w:after="0" w:line="240"/>
+            </w:pPr>
+            <w:r>
+              <w:rPr>
+                <w:rFonts w:ascii="Calibri" w:cs="Calibri" w:eastAsia="Calibri" w:hAnsi="Calibri"/>
+                <w:b/>
+                <w:bCs/>
+                <w:color w:val="FFFFFF"/>
+                <w:sz w:val="18"/>
+                <w:szCs w:val="18"/>
+              </w:rPr>
+              <w:t xml:space="preserve">Column</w:t>
+            </w:r>
+          </w:p>
+        </w:tc>
+        <w:tc>
+          <w:tcPr>
+            <w:tcW w:type="dxa" w:w="2100"/>
+            <w:shd w:fill="0B2545" w:color="auto" w:val="clear"/>
+            <w:tcMar>
+              <w:top w:type="dxa" w:w="40"/>
+              <w:left w:type="dxa" w:w="70"/>
+              <w:bottom w:type="dxa" w:w="40"/>
+              <w:right w:type="dxa" w:w="70"/>
+            </w:tcMar>
+          </w:tcPr>
+          <w:p>
+            <w:pPr>
+              <w:spacing w:after="0" w:line="240"/>
+            </w:pPr>
+            <w:r>
+              <w:rPr>
+                <w:rFonts w:ascii="Calibri" w:cs="Calibri" w:eastAsia="Calibri" w:hAnsi="Calibri"/>
+                <w:b/>
+                <w:bCs/>
+                <w:color w:val="FFFFFF"/>
+                <w:sz w:val="18"/>
+                <w:szCs w:val="18"/>
+              </w:rPr>
+              <w:t xml:space="preserve">Type</w:t>
+            </w:r>
+          </w:p>
+        </w:tc>
+        <w:tc>
+          <w:tcPr>
+            <w:tcW w:type="dxa" w:w="1900"/>
+            <w:shd w:fill="0B2545" w:color="auto" w:val="clear"/>
+            <w:tcMar>
+              <w:top w:type="dxa" w:w="40"/>
+              <w:left w:type="dxa" w:w="70"/>
+              <w:bottom w:type="dxa" w:w="40"/>
+              <w:right w:type="dxa" w:w="70"/>
+            </w:tcMar>
+          </w:tcPr>
+          <w:p>
+            <w:pPr>
+              <w:spacing w:after="0" w:line="240"/>
+            </w:pPr>
+            <w:r>
+              <w:rPr>
+                <w:rFonts w:ascii="Calibri" w:cs="Calibri" w:eastAsia="Calibri" w:hAnsi="Calibri"/>
+                <w:b/>
+                <w:bCs/>
+                <w:color w:val="FFFFFF"/>
+                <w:sz w:val="18"/>
+                <w:szCs w:val="18"/>
+              </w:rPr>
+              <w:t xml:space="preserve">Key / FK</w:t>
+            </w:r>
+          </w:p>
+        </w:tc>
+        <w:tc>
+          <w:tcPr>
+            <w:tcW w:type="dxa" w:w="2100"/>
+            <w:shd w:fill="0B2545" w:color="auto" w:val="clear"/>
+            <w:tcMar>
+              <w:top w:type="dxa" w:w="40"/>
+              <w:left w:type="dxa" w:w="70"/>
+              <w:bottom w:type="dxa" w:w="40"/>
+              <w:right w:type="dxa" w:w="70"/>
+            </w:tcMar>
+          </w:tcPr>
+          <w:p>
+            <w:pPr>
+              <w:spacing w:after="0" w:line="240"/>
+            </w:pPr>
+            <w:r>
+              <w:rPr>
+                <w:rFonts w:ascii="Calibri" w:cs="Calibri" w:eastAsia="Calibri" w:hAnsi="Calibri"/>
+                <w:b/>
+                <w:bCs/>
+                <w:color w:val="FFFFFF"/>
+                <w:sz w:val="18"/>
+                <w:szCs w:val="18"/>
+              </w:rPr>
+              <w:t xml:space="preserve">Notes</w:t>
+            </w:r>
+          </w:p>
+        </w:tc>
+      </w:tr>
+      <w:tr>
+        <w:tc>
+          <w:tcPr>
+            <w:tcW w:type="dxa" w:w="3400"/>
+            <w:shd w:fill="F1F4F9" w:color="auto" w:val="clear"/>
+            <w:tcMar>
+              <w:top w:type="dxa" w:w="40"/>
+              <w:left w:type="dxa" w:w="70"/>
+              <w:bottom w:type="dxa" w:w="40"/>
+              <w:right w:type="dxa" w:w="70"/>
+            </w:tcMar>
+          </w:tcPr>
+          <w:p>
+            <w:pPr>
+              <w:spacing w:after="0" w:line="240"/>
+            </w:pPr>
+            <w:r>
+              <w:rPr>
+                <w:rFonts w:ascii="Calibri" w:cs="Calibri" w:eastAsia="Calibri" w:hAnsi="Calibri"/>
+                <w:b w:val="false"/>
+                <w:bCs w:val="false"/>
+                <w:color w:val="22303F"/>
+                <w:sz w:val="18"/>
+                <w:szCs w:val="18"/>
+              </w:rPr>
+              <w:t xml:space="preserve">Id</w:t>
+            </w:r>
+          </w:p>
+        </w:tc>
+        <w:tc>
+          <w:tcPr>
+            <w:tcW w:type="dxa" w:w="2100"/>
+            <w:shd w:fill="F1F4F9" w:color="auto" w:val="clear"/>
+            <w:tcMar>
+              <w:top w:type="dxa" w:w="40"/>
+              <w:left w:type="dxa" w:w="70"/>
+              <w:bottom w:type="dxa" w:w="40"/>
+              <w:right w:type="dxa" w:w="70"/>
+            </w:tcMar>
+          </w:tcPr>
+          <w:p>
+            <w:pPr>
+              <w:spacing w:after="0" w:line="240"/>
+            </w:pPr>
+            <w:r>
+              <w:rPr>
+                <w:rFonts w:ascii="Calibri" w:cs="Calibri" w:eastAsia="Calibri" w:hAnsi="Calibri"/>
+                <w:b w:val="false"/>
+                <w:bCs w:val="false"/>
+                <w:color w:val="22303F"/>
+                <w:sz w:val="18"/>
+                <w:szCs w:val="18"/>
+              </w:rPr>
+              <w:t xml:space="preserve">int</w:t>
+            </w:r>
+          </w:p>
+        </w:tc>
+        <w:tc>
+          <w:tcPr>
+            <w:tcW w:type="dxa" w:w="1900"/>
+            <w:shd w:fill="F1F4F9" w:color="auto" w:val="clear"/>
+            <w:tcMar>
+              <w:top w:type="dxa" w:w="40"/>
+              <w:left w:type="dxa" w:w="70"/>
+              <w:bottom w:type="dxa" w:w="40"/>
+              <w:right w:type="dxa" w:w="70"/>
+            </w:tcMar>
+          </w:tcPr>
+          <w:p>
+            <w:pPr>
+              <w:spacing w:after="0" w:line="240"/>
+            </w:pPr>
+            <w:r>
+              <w:rPr>
+                <w:rFonts w:ascii="Calibri" w:cs="Calibri" w:eastAsia="Calibri" w:hAnsi="Calibri"/>
+                <w:b w:val="false"/>
+                <w:bCs w:val="false"/>
+                <w:color w:val="22303F"/>
+                <w:sz w:val="18"/>
+                <w:szCs w:val="18"/>
+              </w:rPr>
+              <w:t xml:space="preserve">PK</w:t>
+            </w:r>
+          </w:p>
+        </w:tc>
+        <w:tc>
+          <w:tcPr>
+            <w:tcW w:type="dxa" w:w="2100"/>
+            <w:shd w:fill="F1F4F9" w:color="auto" w:val="clear"/>
+            <w:tcMar>
+              <w:top w:type="dxa" w:w="40"/>
+              <w:left w:type="dxa" w:w="70"/>
+              <w:bottom w:type="dxa" w:w="40"/>
+              <w:right w:type="dxa" w:w="70"/>
+            </w:tcMar>
+          </w:tcPr>
+          <w:p>
+            <w:pPr>
+              <w:spacing w:after="0" w:line="240"/>
+            </w:pPr>
+            <w:r>
+              <w:rPr>
+                <w:rFonts w:ascii="Calibri" w:cs="Calibri" w:eastAsia="Calibri" w:hAnsi="Calibri"/>
+                <w:b w:val="false"/>
+                <w:bCs w:val="false"/>
+                <w:color w:val="22303F"/>
+                <w:sz w:val="18"/>
+                <w:szCs w:val="18"/>
+              </w:rPr>
+              <w:t xml:space="preserve"/>
+            </w:r>
+          </w:p>
+        </w:tc>
+      </w:tr>
+      <w:tr>
+        <w:tc>
+          <w:tcPr>
+            <w:tcW w:type="dxa" w:w="3400"/>
+            <w:tcMar>
+              <w:top w:type="dxa" w:w="40"/>
+              <w:left w:type="dxa" w:w="70"/>
+              <w:bottom w:type="dxa" w:w="40"/>
+              <w:right w:type="dxa" w:w="70"/>
+            </w:tcMar>
+          </w:tcPr>
+          <w:p>
+            <w:pPr>
+              <w:spacing w:after="0" w:line="240"/>
+            </w:pPr>
+            <w:r>
+              <w:rPr>
+                <w:rFonts w:ascii="Calibri" w:cs="Calibri" w:eastAsia="Calibri" w:hAnsi="Calibri"/>
+                <w:b w:val="false"/>
+                <w:bCs w:val="false"/>
+                <w:color w:val="22303F"/>
+                <w:sz w:val="18"/>
+                <w:szCs w:val="18"/>
+              </w:rPr>
+              <w:t xml:space="preserve">Name</w:t>
+            </w:r>
+          </w:p>
+        </w:tc>
+        <w:tc>
+          <w:tcPr>
+            <w:tcW w:type="dxa" w:w="2100"/>
+            <w:tcMar>
+              <w:top w:type="dxa" w:w="40"/>
+              <w:left w:type="dxa" w:w="70"/>
+              <w:bottom w:type="dxa" w:w="40"/>
+              <w:right w:type="dxa" w:w="70"/>
+            </w:tcMar>
+          </w:tcPr>
+          <w:p>
+            <w:pPr>
+              <w:spacing w:after="0" w:line="240"/>
+            </w:pPr>
+            <w:r>
+              <w:rPr>
+                <w:rFonts w:ascii="Calibri" w:cs="Calibri" w:eastAsia="Calibri" w:hAnsi="Calibri"/>
+                <w:b w:val="false"/>
+                <w:bCs w:val="false"/>
+                <w:color w:val="22303F"/>
+                <w:sz w:val="18"/>
+                <w:szCs w:val="18"/>
+              </w:rPr>
+              <w:t xml:space="preserve">string(128)</w:t>
+            </w:r>
+          </w:p>
+        </w:tc>
+        <w:tc>
+          <w:tcPr>
+            <w:tcW w:type="dxa" w:w="1900"/>
+            <w:tcMar>
+              <w:top w:type="dxa" w:w="40"/>
+              <w:left w:type="dxa" w:w="70"/>
+              <w:bottom w:type="dxa" w:w="40"/>
+              <w:right w:type="dxa" w:w="70"/>
+            </w:tcMar>
+          </w:tcPr>
+          <w:p>
+            <w:pPr>
+              <w:spacing w:after="0" w:line="240"/>
+            </w:pPr>
+            <w:r>
+              <w:rPr>
+                <w:rFonts w:ascii="Calibri" w:cs="Calibri" w:eastAsia="Calibri" w:hAnsi="Calibri"/>
+                <w:b w:val="false"/>
+                <w:bCs w:val="false"/>
+                <w:color w:val="22303F"/>
+                <w:sz w:val="18"/>
+                <w:szCs w:val="18"/>
+              </w:rPr>
+              <w:t xml:space="preserve"/>
+            </w:r>
+          </w:p>
+        </w:tc>
+        <w:tc>
+          <w:tcPr>
+            <w:tcW w:type="dxa" w:w="2100"/>
+            <w:tcMar>
+              <w:top w:type="dxa" w:w="40"/>
+              <w:left w:type="dxa" w:w="70"/>
+              <w:bottom w:type="dxa" w:w="40"/>
+              <w:right w:type="dxa" w:w="70"/>
+            </w:tcMar>
+          </w:tcPr>
+          <w:p>
+            <w:pPr>
+              <w:spacing w:after="0" w:line="240"/>
+            </w:pPr>
+            <w:r>
+              <w:rPr>
+                <w:rFonts w:ascii="Calibri" w:cs="Calibri" w:eastAsia="Calibri" w:hAnsi="Calibri"/>
+                <w:b w:val="false"/>
+                <w:bCs w:val="false"/>
+                <w:color w:val="22303F"/>
+                <w:sz w:val="18"/>
+                <w:szCs w:val="18"/>
+              </w:rPr>
+              <w:t xml:space="preserve">NOT NULL; unique index</w:t>
+            </w:r>
+          </w:p>
+        </w:tc>
+      </w:tr>
+      <w:tr>
+        <w:tc>
+          <w:tcPr>
+            <w:tcW w:type="dxa" w:w="3400"/>
+            <w:shd w:fill="F1F4F9" w:color="auto" w:val="clear"/>
+            <w:tcMar>
+              <w:top w:type="dxa" w:w="40"/>
+              <w:left w:type="dxa" w:w="70"/>
+              <w:bottom w:type="dxa" w:w="40"/>
+              <w:right w:type="dxa" w:w="70"/>
+            </w:tcMar>
+          </w:tcPr>
+          <w:p>
+            <w:pPr>
+              <w:spacing w:after="0" w:line="240"/>
+            </w:pPr>
+            <w:r>
+              <w:rPr>
+                <w:rFonts w:ascii="Calibri" w:cs="Calibri" w:eastAsia="Calibri" w:hAnsi="Calibri"/>
+                <w:b w:val="false"/>
+                <w:bCs w:val="false"/>
+                <w:color w:val="22303F"/>
+                <w:sz w:val="18"/>
+                <w:szCs w:val="18"/>
+              </w:rPr>
+              <w:t xml:space="preserve">IsActive</w:t>
+            </w:r>
+          </w:p>
+        </w:tc>
+        <w:tc>
+          <w:tcPr>
+            <w:tcW w:type="dxa" w:w="2100"/>
+            <w:shd w:fill="F1F4F9" w:color="auto" w:val="clear"/>
+            <w:tcMar>
+              <w:top w:type="dxa" w:w="40"/>
+              <w:left w:type="dxa" w:w="70"/>
+              <w:bottom w:type="dxa" w:w="40"/>
+              <w:right w:type="dxa" w:w="70"/>
+            </w:tcMar>
+          </w:tcPr>
+          <w:p>
+            <w:pPr>
+              <w:spacing w:after="0" w:line="240"/>
+            </w:pPr>
+            <w:r>
+              <w:rPr>
+                <w:rFonts w:ascii="Calibri" w:cs="Calibri" w:eastAsia="Calibri" w:hAnsi="Calibri"/>
+                <w:b w:val="false"/>
+                <w:bCs w:val="false"/>
+                <w:color w:val="22303F"/>
+                <w:sz w:val="18"/>
+                <w:szCs w:val="18"/>
+              </w:rPr>
+              <w:t xml:space="preserve">bool</w:t>
+            </w:r>
+          </w:p>
+        </w:tc>
+        <w:tc>
+          <w:tcPr>
+            <w:tcW w:type="dxa" w:w="1900"/>
+            <w:shd w:fill="F1F4F9" w:color="auto" w:val="clear"/>
+            <w:tcMar>
+              <w:top w:type="dxa" w:w="40"/>
+              <w:left w:type="dxa" w:w="70"/>
+              <w:bottom w:type="dxa" w:w="40"/>
+              <w:right w:type="dxa" w:w="70"/>
+            </w:tcMar>
+          </w:tcPr>
+          <w:p>
+            <w:pPr>
+              <w:spacing w:after="0" w:line="240"/>
+            </w:pPr>
+            <w:r>
+              <w:rPr>
+                <w:rFonts w:ascii="Calibri" w:cs="Calibri" w:eastAsia="Calibri" w:hAnsi="Calibri"/>
+                <w:b w:val="false"/>
+                <w:bCs w:val="false"/>
+                <w:color w:val="22303F"/>
+                <w:sz w:val="18"/>
+                <w:szCs w:val="18"/>
+              </w:rPr>
+              <w:t xml:space="preserve"/>
+            </w:r>
+          </w:p>
+        </w:tc>
+        <w:tc>
+          <w:tcPr>
+            <w:tcW w:type="dxa" w:w="2100"/>
+            <w:shd w:fill="F1F4F9" w:color="auto" w:val="clear"/>
+            <w:tcMar>
+              <w:top w:type="dxa" w:w="40"/>
+              <w:left w:type="dxa" w:w="70"/>
+              <w:bottom w:type="dxa" w:w="40"/>
+              <w:right w:type="dxa" w:w="70"/>
+            </w:tcMar>
+          </w:tcPr>
+          <w:p>
+            <w:pPr>
+              <w:spacing w:after="0" w:line="240"/>
+            </w:pPr>
+            <w:r>
+              <w:rPr>
+                <w:rFonts w:ascii="Calibri" w:cs="Calibri" w:eastAsia="Calibri" w:hAnsi="Calibri"/>
+                <w:b w:val="false"/>
+                <w:bCs w:val="false"/>
+                <w:color w:val="22303F"/>
+                <w:sz w:val="18"/>
+                <w:szCs w:val="18"/>
+              </w:rPr>
+              <w:t xml:space="preserve">Default true; when false the group is kept but excluded from notifications</w:t>
+            </w:r>
+          </w:p>
+        </w:tc>
+      </w:tr>
+      <w:tr>
+        <w:tc>
+          <w:tcPr>
+            <w:tcW w:type="dxa" w:w="3400"/>
+            <w:tcMar>
+              <w:top w:type="dxa" w:w="40"/>
+              <w:left w:type="dxa" w:w="70"/>
+              <w:bottom w:type="dxa" w:w="40"/>
+              <w:right w:type="dxa" w:w="70"/>
+            </w:tcMar>
+          </w:tcPr>
+          <w:p>
+            <w:pPr>
+              <w:spacing w:after="0" w:line="240"/>
+            </w:pPr>
+            <w:r>
+              <w:rPr>
+                <w:rFonts w:ascii="Calibri" w:cs="Calibri" w:eastAsia="Calibri" w:hAnsi="Calibri"/>
+                <w:b w:val="false"/>
+                <w:bCs w:val="false"/>
+                <w:color w:val="22303F"/>
+                <w:sz w:val="18"/>
+                <w:szCs w:val="18"/>
+              </w:rPr>
+              <w:t xml:space="preserve">CreatedAt</w:t>
+            </w:r>
+          </w:p>
+        </w:tc>
+        <w:tc>
+          <w:tcPr>
+            <w:tcW w:type="dxa" w:w="2100"/>
+            <w:tcMar>
+              <w:top w:type="dxa" w:w="40"/>
+              <w:left w:type="dxa" w:w="70"/>
+              <w:bottom w:type="dxa" w:w="40"/>
+              <w:right w:type="dxa" w:w="70"/>
+            </w:tcMar>
+          </w:tcPr>
+          <w:p>
+            <w:pPr>
+              <w:spacing w:after="0" w:line="240"/>
+            </w:pPr>
+            <w:r>
+              <w:rPr>
+                <w:rFonts w:ascii="Calibri" w:cs="Calibri" w:eastAsia="Calibri" w:hAnsi="Calibri"/>
+                <w:b w:val="false"/>
+                <w:bCs w:val="false"/>
+                <w:color w:val="22303F"/>
+                <w:sz w:val="18"/>
+                <w:szCs w:val="18"/>
+              </w:rPr>
+              <w:t xml:space="preserve">DateTime</w:t>
+            </w:r>
+          </w:p>
+        </w:tc>
+        <w:tc>
+          <w:tcPr>
+            <w:tcW w:type="dxa" w:w="1900"/>
+            <w:tcMar>
+              <w:top w:type="dxa" w:w="40"/>
+              <w:left w:type="dxa" w:w="70"/>
+              <w:bottom w:type="dxa" w:w="40"/>
+              <w:right w:type="dxa" w:w="70"/>
+            </w:tcMar>
+          </w:tcPr>
+          <w:p>
+            <w:pPr>
+              <w:spacing w:after="0" w:line="240"/>
+            </w:pPr>
+            <w:r>
+              <w:rPr>
+                <w:rFonts w:ascii="Calibri" w:cs="Calibri" w:eastAsia="Calibri" w:hAnsi="Calibri"/>
+                <w:b w:val="false"/>
+                <w:bCs w:val="false"/>
+                <w:color w:val="22303F"/>
+                <w:sz w:val="18"/>
+                <w:szCs w:val="18"/>
+              </w:rPr>
+              <w:t xml:space="preserve"/>
+            </w:r>
+          </w:p>
+        </w:tc>
+        <w:tc>
+          <w:tcPr>
+            <w:tcW w:type="dxa" w:w="2100"/>
+            <w:tcMar>
+              <w:top w:type="dxa" w:w="40"/>
+              <w:left w:type="dxa" w:w="70"/>
+              <w:bottom w:type="dxa" w:w="40"/>
+              <w:right w:type="dxa" w:w="70"/>
+            </w:tcMar>
+          </w:tcPr>
+          <w:p>
+            <w:pPr>
+              <w:spacing w:after="0" w:line="240"/>
+            </w:pPr>
+            <w:r>
+              <w:rPr>
+                <w:rFonts w:ascii="Calibri" w:cs="Calibri" w:eastAsia="Calibri" w:hAnsi="Calibri"/>
+                <w:b w:val="false"/>
+                <w:bCs w:val="false"/>
+                <w:color w:val="22303F"/>
+                <w:sz w:val="18"/>
+                <w:szCs w:val="18"/>
+              </w:rPr>
+              <w:t xml:space="preserve"/>
+            </w:r>
+          </w:p>
+        </w:tc>
+      </w:tr>
+    </w:tbl>
+    <w:p>
+      <w:pPr>
+        <w:pStyle w:val="Heading2"/>
+        <w:spacing w:after="90" w:before="200"/>
+      </w:pPr>
+      <w:r>
+        <w:rPr>
+          <w:rFonts w:ascii="Calibri" w:cs="Calibri" w:eastAsia="Calibri" w:hAnsi="Calibri"/>
+          <w:b/>
+          <w:bCs/>
+          <w:color w:val="274A7D"/>
+          <w:sz w:val="25"/>
+          <w:szCs w:val="25"/>
+        </w:rPr>
+        <w:t xml:space="preserve">4.2 NotificationGroupUsers (join table)</w:t>
+      </w:r>
+    </w:p>
+    <w:p>
+      <w:pPr>
+        <w:spacing w:after="120" w:line="276"/>
+      </w:pPr>
+      <w:r>
+        <w:rPr>
+          <w:rFonts w:ascii="Calibri" w:cs="Calibri" w:eastAsia="Calibri" w:hAnsi="Calibri"/>
+          <w:sz w:val="21"/>
+          <w:szCs w:val="21"/>
+        </w:rPr>
+        <w:t xml:space="preserve">The many-to-many join between NotificationGroups and Users. Composite primary key (NotificationGroupId, UserId); both foreign keys cascade on delete; a secondary index on UserId supports reverse lookups.</w:t>
+      </w:r>
+    </w:p>
+    <w:tbl>
+      <w:tblPr>
+        <w:tblW w:type="dxa" w:w="9500"/>
+        <w:tblBorders>
+          <w:top w:val="single" w:color="D3DAE6" w:sz="4"/>
+          <w:left w:val="single" w:color="D3DAE6" w:sz="4"/>
+          <w:bottom w:val="single" w:color="D3DAE6" w:sz="4"/>
+          <w:right w:val="single" w:color="D3DAE6" w:sz="4"/>
+          <w:insideH w:val="single" w:color="D3DAE6" w:sz="4"/>
+          <w:insideV w:val="single" w:color="D3DAE6" w:sz="4"/>
+        </w:tblBorders>
+      </w:tblPr>
+      <w:tblGrid>
+        <w:gridCol w:w="3400"/>
+        <w:gridCol w:w="2100"/>
+        <w:gridCol w:w="1900"/>
+        <w:gridCol w:w="2100"/>
+      </w:tblGrid>
+      <w:tr>
+        <w:trPr>
+          <w:tblHeader/>
+        </w:trPr>
+        <w:tc>
+          <w:tcPr>
+            <w:tcW w:type="dxa" w:w="3400"/>
+            <w:shd w:fill="0B2545" w:color="auto" w:val="clear"/>
+            <w:tcMar>
+              <w:top w:type="dxa" w:w="40"/>
+              <w:left w:type="dxa" w:w="70"/>
+              <w:bottom w:type="dxa" w:w="40"/>
+              <w:right w:type="dxa" w:w="70"/>
+            </w:tcMar>
+          </w:tcPr>
+          <w:p>
+            <w:pPr>
+              <w:spacing w:after="0" w:line="240"/>
+            </w:pPr>
+            <w:r>
+              <w:rPr>
+                <w:rFonts w:ascii="Calibri" w:cs="Calibri" w:eastAsia="Calibri" w:hAnsi="Calibri"/>
+                <w:b/>
+                <w:bCs/>
+                <w:color w:val="FFFFFF"/>
+                <w:sz w:val="18"/>
+                <w:szCs w:val="18"/>
+              </w:rPr>
+              <w:t xml:space="preserve">Column</w:t>
+            </w:r>
+          </w:p>
+        </w:tc>
+        <w:tc>
+          <w:tcPr>
+            <w:tcW w:type="dxa" w:w="2100"/>
+            <w:shd w:fill="0B2545" w:color="auto" w:val="clear"/>
+            <w:tcMar>
+              <w:top w:type="dxa" w:w="40"/>
+              <w:left w:type="dxa" w:w="70"/>
+              <w:bottom w:type="dxa" w:w="40"/>
+              <w:right w:type="dxa" w:w="70"/>
+            </w:tcMar>
+          </w:tcPr>
+          <w:p>
+            <w:pPr>
+              <w:spacing w:after="0" w:line="240"/>
+            </w:pPr>
+            <w:r>
+              <w:rPr>
+                <w:rFonts w:ascii="Calibri" w:cs="Calibri" w:eastAsia="Calibri" w:hAnsi="Calibri"/>
+                <w:b/>
+                <w:bCs/>
+                <w:color w:val="FFFFFF"/>
+                <w:sz w:val="18"/>
+                <w:szCs w:val="18"/>
+              </w:rPr>
+              <w:t xml:space="preserve">Type</w:t>
+            </w:r>
+          </w:p>
+        </w:tc>
+        <w:tc>
+          <w:tcPr>
+            <w:tcW w:type="dxa" w:w="1900"/>
+            <w:shd w:fill="0B2545" w:color="auto" w:val="clear"/>
+            <w:tcMar>
+              <w:top w:type="dxa" w:w="40"/>
+              <w:left w:type="dxa" w:w="70"/>
+              <w:bottom w:type="dxa" w:w="40"/>
+              <w:right w:type="dxa" w:w="70"/>
+            </w:tcMar>
+          </w:tcPr>
+          <w:p>
+            <w:pPr>
+              <w:spacing w:after="0" w:line="240"/>
+            </w:pPr>
+            <w:r>
+              <w:rPr>
+                <w:rFonts w:ascii="Calibri" w:cs="Calibri" w:eastAsia="Calibri" w:hAnsi="Calibri"/>
+                <w:b/>
+                <w:bCs/>
+                <w:color w:val="FFFFFF"/>
+                <w:sz w:val="18"/>
+                <w:szCs w:val="18"/>
+              </w:rPr>
+              <w:t xml:space="preserve">Key / FK</w:t>
+            </w:r>
+          </w:p>
+        </w:tc>
+        <w:tc>
+          <w:tcPr>
+            <w:tcW w:type="dxa" w:w="2100"/>
+            <w:shd w:fill="0B2545" w:color="auto" w:val="clear"/>
+            <w:tcMar>
+              <w:top w:type="dxa" w:w="40"/>
+              <w:left w:type="dxa" w:w="70"/>
+              <w:bottom w:type="dxa" w:w="40"/>
+              <w:right w:type="dxa" w:w="70"/>
+            </w:tcMar>
+          </w:tcPr>
+          <w:p>
+            <w:pPr>
+              <w:spacing w:after="0" w:line="240"/>
+            </w:pPr>
+            <w:r>
+              <w:rPr>
+                <w:rFonts w:ascii="Calibri" w:cs="Calibri" w:eastAsia="Calibri" w:hAnsi="Calibri"/>
+                <w:b/>
+                <w:bCs/>
+                <w:color w:val="FFFFFF"/>
+                <w:sz w:val="18"/>
+                <w:szCs w:val="18"/>
+              </w:rPr>
+              <w:t xml:space="preserve">Notes</w:t>
+            </w:r>
+          </w:p>
+        </w:tc>
+      </w:tr>
+      <w:tr>
+        <w:tc>
+          <w:tcPr>
+            <w:tcW w:type="dxa" w:w="3400"/>
+            <w:shd w:fill="F1F4F9" w:color="auto" w:val="clear"/>
+            <w:tcMar>
+              <w:top w:type="dxa" w:w="40"/>
+              <w:left w:type="dxa" w:w="70"/>
+              <w:bottom w:type="dxa" w:w="40"/>
+              <w:right w:type="dxa" w:w="70"/>
+            </w:tcMar>
+          </w:tcPr>
+          <w:p>
+            <w:pPr>
+              <w:spacing w:after="0" w:line="240"/>
+            </w:pPr>
+            <w:r>
+              <w:rPr>
+                <w:rFonts w:ascii="Calibri" w:cs="Calibri" w:eastAsia="Calibri" w:hAnsi="Calibri"/>
+                <w:b w:val="false"/>
+                <w:bCs w:val="false"/>
+                <w:color w:val="22303F"/>
+                <w:sz w:val="18"/>
+                <w:szCs w:val="18"/>
+              </w:rPr>
+              <w:t xml:space="preserve">NotificationGroupId</w:t>
+            </w:r>
+          </w:p>
+        </w:tc>
+        <w:tc>
+          <w:tcPr>
+            <w:tcW w:type="dxa" w:w="2100"/>
+            <w:shd w:fill="F1F4F9" w:color="auto" w:val="clear"/>
+            <w:tcMar>
+              <w:top w:type="dxa" w:w="40"/>
+              <w:left w:type="dxa" w:w="70"/>
+              <w:bottom w:type="dxa" w:w="40"/>
+              <w:right w:type="dxa" w:w="70"/>
+            </w:tcMar>
+          </w:tcPr>
+          <w:p>
+            <w:pPr>
+              <w:spacing w:after="0" w:line="240"/>
+            </w:pPr>
+            <w:r>
+              <w:rPr>
+                <w:rFonts w:ascii="Calibri" w:cs="Calibri" w:eastAsia="Calibri" w:hAnsi="Calibri"/>
+                <w:b w:val="false"/>
+                <w:bCs w:val="false"/>
+                <w:color w:val="22303F"/>
+                <w:sz w:val="18"/>
+                <w:szCs w:val="18"/>
+              </w:rPr>
+              <w:t xml:space="preserve">int</w:t>
+            </w:r>
+          </w:p>
+        </w:tc>
+        <w:tc>
+          <w:tcPr>
+            <w:tcW w:type="dxa" w:w="1900"/>
+            <w:shd w:fill="F1F4F9" w:color="auto" w:val="clear"/>
+            <w:tcMar>
+              <w:top w:type="dxa" w:w="40"/>
+              <w:left w:type="dxa" w:w="70"/>
+              <w:bottom w:type="dxa" w:w="40"/>
+              <w:right w:type="dxa" w:w="70"/>
+            </w:tcMar>
+          </w:tcPr>
+          <w:p>
+            <w:pPr>
+              <w:spacing w:after="0" w:line="240"/>
+            </w:pPr>
+            <w:r>
+              <w:rPr>
+                <w:rFonts w:ascii="Calibri" w:cs="Calibri" w:eastAsia="Calibri" w:hAnsi="Calibri"/>
+                <w:b w:val="false"/>
+                <w:bCs w:val="false"/>
+                <w:color w:val="22303F"/>
+                <w:sz w:val="18"/>
+                <w:szCs w:val="18"/>
+              </w:rPr>
+              <w:t xml:space="preserve">FK → NotificationGroup</w:t>
+            </w:r>
+          </w:p>
+        </w:tc>
+        <w:tc>
+          <w:tcPr>
+            <w:tcW w:type="dxa" w:w="2100"/>
+            <w:shd w:fill="F1F4F9" w:color="auto" w:val="clear"/>
+            <w:tcMar>
+              <w:top w:type="dxa" w:w="40"/>
+              <w:left w:type="dxa" w:w="70"/>
+              <w:bottom w:type="dxa" w:w="40"/>
+              <w:right w:type="dxa" w:w="70"/>
+            </w:tcMar>
+          </w:tcPr>
+          <w:p>
+            <w:pPr>
+              <w:spacing w:after="0" w:line="240"/>
+            </w:pPr>
+            <w:r>
+              <w:rPr>
+                <w:rFonts w:ascii="Calibri" w:cs="Calibri" w:eastAsia="Calibri" w:hAnsi="Calibri"/>
+                <w:b w:val="false"/>
+                <w:bCs w:val="false"/>
+                <w:color w:val="22303F"/>
+                <w:sz w:val="18"/>
+                <w:szCs w:val="18"/>
+              </w:rPr>
+              <w:t xml:space="preserve">Composite PK; ON DELETE CASCADE</w:t>
+            </w:r>
+          </w:p>
+        </w:tc>
+      </w:tr>
+      <w:tr>
+        <w:tc>
+          <w:tcPr>
+            <w:tcW w:type="dxa" w:w="3400"/>
+            <w:tcMar>
+              <w:top w:type="dxa" w:w="40"/>
+              <w:left w:type="dxa" w:w="70"/>
+              <w:bottom w:type="dxa" w:w="40"/>
+              <w:right w:type="dxa" w:w="70"/>
+            </w:tcMar>
+          </w:tcPr>
+          <w:p>
+            <w:pPr>
+              <w:spacing w:after="0" w:line="240"/>
+            </w:pPr>
+            <w:r>
+              <w:rPr>
+                <w:rFonts w:ascii="Calibri" w:cs="Calibri" w:eastAsia="Calibri" w:hAnsi="Calibri"/>
+                <w:b w:val="false"/>
+                <w:bCs w:val="false"/>
+                <w:color w:val="22303F"/>
+                <w:sz w:val="18"/>
+                <w:szCs w:val="18"/>
+              </w:rPr>
+              <w:t xml:space="preserve">UserId</w:t>
+            </w:r>
+          </w:p>
+        </w:tc>
+        <w:tc>
+          <w:tcPr>
+            <w:tcW w:type="dxa" w:w="2100"/>
+            <w:tcMar>
+              <w:top w:type="dxa" w:w="40"/>
+              <w:left w:type="dxa" w:w="70"/>
+              <w:bottom w:type="dxa" w:w="40"/>
+              <w:right w:type="dxa" w:w="70"/>
+            </w:tcMar>
+          </w:tcPr>
+          <w:p>
+            <w:pPr>
+              <w:spacing w:after="0" w:line="240"/>
+            </w:pPr>
+            <w:r>
+              <w:rPr>
+                <w:rFonts w:ascii="Calibri" w:cs="Calibri" w:eastAsia="Calibri" w:hAnsi="Calibri"/>
+                <w:b w:val="false"/>
+                <w:bCs w:val="false"/>
+                <w:color w:val="22303F"/>
+                <w:sz w:val="18"/>
+                <w:szCs w:val="18"/>
+              </w:rPr>
+              <w:t xml:space="preserve">int</w:t>
+            </w:r>
+          </w:p>
+        </w:tc>
+        <w:tc>
+          <w:tcPr>
+            <w:tcW w:type="dxa" w:w="1900"/>
+            <w:tcMar>
+              <w:top w:type="dxa" w:w="40"/>
+              <w:left w:type="dxa" w:w="70"/>
+              <w:bottom w:type="dxa" w:w="40"/>
+              <w:right w:type="dxa" w:w="70"/>
+            </w:tcMar>
+          </w:tcPr>
+          <w:p>
+            <w:pPr>
+              <w:spacing w:after="0" w:line="240"/>
+            </w:pPr>
+            <w:r>
+              <w:rPr>
+                <w:rFonts w:ascii="Calibri" w:cs="Calibri" w:eastAsia="Calibri" w:hAnsi="Calibri"/>
+                <w:b w:val="false"/>
+                <w:bCs w:val="false"/>
+                <w:color w:val="22303F"/>
+                <w:sz w:val="18"/>
+                <w:szCs w:val="18"/>
+              </w:rPr>
+              <w:t xml:space="preserve">FK → User</w:t>
+            </w:r>
+          </w:p>
+        </w:tc>
+        <w:tc>
+          <w:tcPr>
+            <w:tcW w:type="dxa" w:w="2100"/>
+            <w:tcMar>
+              <w:top w:type="dxa" w:w="40"/>
+              <w:left w:type="dxa" w:w="70"/>
+              <w:bottom w:type="dxa" w:w="40"/>
+              <w:right w:type="dxa" w:w="70"/>
+            </w:tcMar>
+          </w:tcPr>
+          <w:p>
+            <w:pPr>
+              <w:spacing w:after="0" w:line="240"/>
+            </w:pPr>
+            <w:r>
+              <w:rPr>
+                <w:rFonts w:ascii="Calibri" w:cs="Calibri" w:eastAsia="Calibri" w:hAnsi="Calibri"/>
+                <w:b w:val="false"/>
+                <w:bCs w:val="false"/>
+                <w:color w:val="22303F"/>
+                <w:sz w:val="18"/>
+                <w:szCs w:val="18"/>
+              </w:rPr>
+              <w:t xml:space="preserve">Composite PK; ON DELETE CASCADE; index on UserId</w:t>
+            </w:r>
+          </w:p>
+        </w:tc>
+      </w:tr>
+    </w:tbl>
+    <w:p>
+      <w:pPr>
+        <w:pStyle w:val="Heading2"/>
+        <w:spacing w:after="90" w:before="200"/>
+      </w:pPr>
+      <w:r>
+        <w:rPr>
+          <w:rFonts w:ascii="Calibri" w:cs="Calibri" w:eastAsia="Calibri" w:hAnsi="Calibri"/>
+          <w:b/>
+          <w:bCs/>
+          <w:color w:val="274A7D"/>
+          <w:sz w:val="25"/>
+          <w:szCs w:val="25"/>
+        </w:rPr>
+        <w:t xml:space="preserve">4.3 ScheduledReport</w:t>
+      </w:r>
+    </w:p>
+    <w:p>
+      <w:pPr>
+        <w:spacing w:after="120" w:line="276"/>
+      </w:pPr>
+      <w:r>
+        <w:rPr>
+          <w:rFonts w:ascii="Calibri" w:cs="Calibri" w:eastAsia="Calibri" w:hAnsi="Calibri"/>
+          <w:sz w:val="21"/>
+          <w:szCs w:val="21"/>
+        </w:rPr>
+        <w:t xml:space="preserve">An administrator-defined schedule that emails a supplier report (PDF/Excel) as a file attachment to the active members of a notification group. The runner fires a schedule when NextRunUtc is due; recurring frequencies advance, and a Once schedule disables itself after running.</w:t>
+      </w:r>
+    </w:p>
+    <w:tbl>
+      <w:tblPr>
+        <w:tblW w:type="dxa" w:w="9500"/>
+        <w:tblBorders>
+          <w:top w:val="single" w:color="D3DAE6" w:sz="4"/>
+          <w:left w:val="single" w:color="D3DAE6" w:sz="4"/>
+          <w:bottom w:val="single" w:color="D3DAE6" w:sz="4"/>
+          <w:right w:val="single" w:color="D3DAE6" w:sz="4"/>
+          <w:insideH w:val="single" w:color="D3DAE6" w:sz="4"/>
+          <w:insideV w:val="single" w:color="D3DAE6" w:sz="4"/>
+        </w:tblBorders>
+      </w:tblPr>
+      <w:tblGrid>
+        <w:gridCol w:w="3400"/>
+        <w:gridCol w:w="2100"/>
+        <w:gridCol w:w="1900"/>
+        <w:gridCol w:w="2100"/>
+      </w:tblGrid>
+      <w:tr>
+        <w:trPr>
+          <w:tblHeader/>
+        </w:trPr>
+        <w:tc>
+          <w:tcPr>
+            <w:tcW w:type="dxa" w:w="3400"/>
+            <w:shd w:fill="0B2545" w:color="auto" w:val="clear"/>
+            <w:tcMar>
+              <w:top w:type="dxa" w:w="40"/>
+              <w:left w:type="dxa" w:w="70"/>
+              <w:bottom w:type="dxa" w:w="40"/>
+              <w:right w:type="dxa" w:w="70"/>
+            </w:tcMar>
+          </w:tcPr>
+          <w:p>
+            <w:pPr>
+              <w:spacing w:after="0" w:line="240"/>
+            </w:pPr>
+            <w:r>
+              <w:rPr>
+                <w:rFonts w:ascii="Calibri" w:cs="Calibri" w:eastAsia="Calibri" w:hAnsi="Calibri"/>
+                <w:b/>
+                <w:bCs/>
+                <w:color w:val="FFFFFF"/>
+                <w:sz w:val="18"/>
+                <w:szCs w:val="18"/>
+              </w:rPr>
+              <w:t xml:space="preserve">Column</w:t>
+            </w:r>
+          </w:p>
+        </w:tc>
+        <w:tc>
+          <w:tcPr>
+            <w:tcW w:type="dxa" w:w="2100"/>
+            <w:shd w:fill="0B2545" w:color="auto" w:val="clear"/>
+            <w:tcMar>
+              <w:top w:type="dxa" w:w="40"/>
+              <w:left w:type="dxa" w:w="70"/>
+              <w:bottom w:type="dxa" w:w="40"/>
+              <w:right w:type="dxa" w:w="70"/>
+            </w:tcMar>
+          </w:tcPr>
+          <w:p>
+            <w:pPr>
+              <w:spacing w:after="0" w:line="240"/>
+            </w:pPr>
+            <w:r>
+              <w:rPr>
+                <w:rFonts w:ascii="Calibri" w:cs="Calibri" w:eastAsia="Calibri" w:hAnsi="Calibri"/>
+                <w:b/>
+                <w:bCs/>
+                <w:color w:val="FFFFFF"/>
+                <w:sz w:val="18"/>
+                <w:szCs w:val="18"/>
+              </w:rPr>
+              <w:t xml:space="preserve">Type</w:t>
+            </w:r>
+          </w:p>
+        </w:tc>
+        <w:tc>
+          <w:tcPr>
+            <w:tcW w:type="dxa" w:w="1900"/>
+            <w:shd w:fill="0B2545" w:color="auto" w:val="clear"/>
+            <w:tcMar>
+              <w:top w:type="dxa" w:w="40"/>
+              <w:left w:type="dxa" w:w="70"/>
+              <w:bottom w:type="dxa" w:w="40"/>
+              <w:right w:type="dxa" w:w="70"/>
+            </w:tcMar>
+          </w:tcPr>
+          <w:p>
+            <w:pPr>
+              <w:spacing w:after="0" w:line="240"/>
+            </w:pPr>
+            <w:r>
+              <w:rPr>
+                <w:rFonts w:ascii="Calibri" w:cs="Calibri" w:eastAsia="Calibri" w:hAnsi="Calibri"/>
+                <w:b/>
+                <w:bCs/>
+                <w:color w:val="FFFFFF"/>
+                <w:sz w:val="18"/>
+                <w:szCs w:val="18"/>
+              </w:rPr>
+              <w:t xml:space="preserve">Key / FK</w:t>
+            </w:r>
+          </w:p>
+        </w:tc>
+        <w:tc>
+          <w:tcPr>
+            <w:tcW w:type="dxa" w:w="2100"/>
+            <w:shd w:fill="0B2545" w:color="auto" w:val="clear"/>
+            <w:tcMar>
+              <w:top w:type="dxa" w:w="40"/>
+              <w:left w:type="dxa" w:w="70"/>
+              <w:bottom w:type="dxa" w:w="40"/>
+              <w:right w:type="dxa" w:w="70"/>
+            </w:tcMar>
+          </w:tcPr>
+          <w:p>
+            <w:pPr>
+              <w:spacing w:after="0" w:line="240"/>
+            </w:pPr>
+            <w:r>
+              <w:rPr>
+                <w:rFonts w:ascii="Calibri" w:cs="Calibri" w:eastAsia="Calibri" w:hAnsi="Calibri"/>
+                <w:b/>
+                <w:bCs/>
+                <w:color w:val="FFFFFF"/>
+                <w:sz w:val="18"/>
+                <w:szCs w:val="18"/>
+              </w:rPr>
+              <w:t xml:space="preserve">Notes</w:t>
+            </w:r>
+          </w:p>
+        </w:tc>
+      </w:tr>
+      <w:tr>
+        <w:tc>
+          <w:tcPr>
+            <w:tcW w:type="dxa" w:w="3400"/>
+            <w:shd w:fill="F1F4F9" w:color="auto" w:val="clear"/>
+            <w:tcMar>
+              <w:top w:type="dxa" w:w="40"/>
+              <w:left w:type="dxa" w:w="70"/>
+              <w:bottom w:type="dxa" w:w="40"/>
+              <w:right w:type="dxa" w:w="70"/>
+            </w:tcMar>
+          </w:tcPr>
+          <w:p>
+            <w:pPr>
+              <w:spacing w:after="0" w:line="240"/>
+            </w:pPr>
+            <w:r>
+              <w:rPr>
+                <w:rFonts w:ascii="Calibri" w:cs="Calibri" w:eastAsia="Calibri" w:hAnsi="Calibri"/>
+                <w:b w:val="false"/>
+                <w:bCs w:val="false"/>
+                <w:color w:val="22303F"/>
+                <w:sz w:val="18"/>
+                <w:szCs w:val="18"/>
+              </w:rPr>
+              <w:t xml:space="preserve">Id</w:t>
+            </w:r>
+          </w:p>
+        </w:tc>
+        <w:tc>
+          <w:tcPr>
+            <w:tcW w:type="dxa" w:w="2100"/>
+            <w:shd w:fill="F1F4F9" w:color="auto" w:val="clear"/>
+            <w:tcMar>
+              <w:top w:type="dxa" w:w="40"/>
+              <w:left w:type="dxa" w:w="70"/>
+              <w:bottom w:type="dxa" w:w="40"/>
+              <w:right w:type="dxa" w:w="70"/>
+            </w:tcMar>
+          </w:tcPr>
+          <w:p>
+            <w:pPr>
+              <w:spacing w:after="0" w:line="240"/>
+            </w:pPr>
+            <w:r>
+              <w:rPr>
+                <w:rFonts w:ascii="Calibri" w:cs="Calibri" w:eastAsia="Calibri" w:hAnsi="Calibri"/>
+                <w:b w:val="false"/>
+                <w:bCs w:val="false"/>
+                <w:color w:val="22303F"/>
+                <w:sz w:val="18"/>
+                <w:szCs w:val="18"/>
+              </w:rPr>
+              <w:t xml:space="preserve">int</w:t>
+            </w:r>
+          </w:p>
+        </w:tc>
+        <w:tc>
+          <w:tcPr>
+            <w:tcW w:type="dxa" w:w="1900"/>
+            <w:shd w:fill="F1F4F9" w:color="auto" w:val="clear"/>
+            <w:tcMar>
+              <w:top w:type="dxa" w:w="40"/>
+              <w:left w:type="dxa" w:w="70"/>
+              <w:bottom w:type="dxa" w:w="40"/>
+              <w:right w:type="dxa" w:w="70"/>
+            </w:tcMar>
+          </w:tcPr>
+          <w:p>
+            <w:pPr>
+              <w:spacing w:after="0" w:line="240"/>
+            </w:pPr>
+            <w:r>
+              <w:rPr>
+                <w:rFonts w:ascii="Calibri" w:cs="Calibri" w:eastAsia="Calibri" w:hAnsi="Calibri"/>
+                <w:b w:val="false"/>
+                <w:bCs w:val="false"/>
+                <w:color w:val="22303F"/>
+                <w:sz w:val="18"/>
+                <w:szCs w:val="18"/>
+              </w:rPr>
+              <w:t xml:space="preserve">PK</w:t>
+            </w:r>
+          </w:p>
+        </w:tc>
+        <w:tc>
+          <w:tcPr>
+            <w:tcW w:type="dxa" w:w="2100"/>
+            <w:shd w:fill="F1F4F9" w:color="auto" w:val="clear"/>
+            <w:tcMar>
+              <w:top w:type="dxa" w:w="40"/>
+              <w:left w:type="dxa" w:w="70"/>
+              <w:bottom w:type="dxa" w:w="40"/>
+              <w:right w:type="dxa" w:w="70"/>
+            </w:tcMar>
+          </w:tcPr>
+          <w:p>
+            <w:pPr>
+              <w:spacing w:after="0" w:line="240"/>
+            </w:pPr>
+            <w:r>
+              <w:rPr>
+                <w:rFonts w:ascii="Calibri" w:cs="Calibri" w:eastAsia="Calibri" w:hAnsi="Calibri"/>
+                <w:b w:val="false"/>
+                <w:bCs w:val="false"/>
+                <w:color w:val="22303F"/>
+                <w:sz w:val="18"/>
+                <w:szCs w:val="18"/>
+              </w:rPr>
+              <w:t xml:space="preserve"/>
+            </w:r>
+          </w:p>
+        </w:tc>
+      </w:tr>
+      <w:tr>
+        <w:tc>
+          <w:tcPr>
+            <w:tcW w:type="dxa" w:w="3400"/>
+            <w:tcMar>
+              <w:top w:type="dxa" w:w="40"/>
+              <w:left w:type="dxa" w:w="70"/>
+              <w:bottom w:type="dxa" w:w="40"/>
+              <w:right w:type="dxa" w:w="70"/>
+            </w:tcMar>
+          </w:tcPr>
+          <w:p>
+            <w:pPr>
+              <w:spacing w:after="0" w:line="240"/>
+            </w:pPr>
+            <w:r>
+              <w:rPr>
+                <w:rFonts w:ascii="Calibri" w:cs="Calibri" w:eastAsia="Calibri" w:hAnsi="Calibri"/>
+                <w:b w:val="false"/>
+                <w:bCs w:val="false"/>
+                <w:color w:val="22303F"/>
+                <w:sz w:val="18"/>
+                <w:szCs w:val="18"/>
+              </w:rPr>
+              <w:t xml:space="preserve">Name</w:t>
+            </w:r>
+          </w:p>
+        </w:tc>
+        <w:tc>
+          <w:tcPr>
+            <w:tcW w:type="dxa" w:w="2100"/>
+            <w:tcMar>
+              <w:top w:type="dxa" w:w="40"/>
+              <w:left w:type="dxa" w:w="70"/>
+              <w:bottom w:type="dxa" w:w="40"/>
+              <w:right w:type="dxa" w:w="70"/>
+            </w:tcMar>
+          </w:tcPr>
+          <w:p>
+            <w:pPr>
+              <w:spacing w:after="0" w:line="240"/>
+            </w:pPr>
+            <w:r>
+              <w:rPr>
+                <w:rFonts w:ascii="Calibri" w:cs="Calibri" w:eastAsia="Calibri" w:hAnsi="Calibri"/>
+                <w:b w:val="false"/>
+                <w:bCs w:val="false"/>
+                <w:color w:val="22303F"/>
+                <w:sz w:val="18"/>
+                <w:szCs w:val="18"/>
+              </w:rPr>
+              <w:t xml:space="preserve">string(150)</w:t>
+            </w:r>
+          </w:p>
+        </w:tc>
+        <w:tc>
+          <w:tcPr>
+            <w:tcW w:type="dxa" w:w="1900"/>
+            <w:tcMar>
+              <w:top w:type="dxa" w:w="40"/>
+              <w:left w:type="dxa" w:w="70"/>
+              <w:bottom w:type="dxa" w:w="40"/>
+              <w:right w:type="dxa" w:w="70"/>
+            </w:tcMar>
+          </w:tcPr>
+          <w:p>
+            <w:pPr>
+              <w:spacing w:after="0" w:line="240"/>
+            </w:pPr>
+            <w:r>
+              <w:rPr>
+                <w:rFonts w:ascii="Calibri" w:cs="Calibri" w:eastAsia="Calibri" w:hAnsi="Calibri"/>
+                <w:b w:val="false"/>
+                <w:bCs w:val="false"/>
+                <w:color w:val="22303F"/>
+                <w:sz w:val="18"/>
+                <w:szCs w:val="18"/>
+              </w:rPr>
+              <w:t xml:space="preserve"/>
+            </w:r>
+          </w:p>
+        </w:tc>
+        <w:tc>
+          <w:tcPr>
+            <w:tcW w:type="dxa" w:w="2100"/>
+            <w:tcMar>
+              <w:top w:type="dxa" w:w="40"/>
+              <w:left w:type="dxa" w:w="70"/>
+              <w:bottom w:type="dxa" w:w="40"/>
+              <w:right w:type="dxa" w:w="70"/>
+            </w:tcMar>
+          </w:tcPr>
+          <w:p>
+            <w:pPr>
+              <w:spacing w:after="0" w:line="240"/>
+            </w:pPr>
+            <w:r>
+              <w:rPr>
+                <w:rFonts w:ascii="Calibri" w:cs="Calibri" w:eastAsia="Calibri" w:hAnsi="Calibri"/>
+                <w:b w:val="false"/>
+                <w:bCs w:val="false"/>
+                <w:color w:val="22303F"/>
+                <w:sz w:val="18"/>
+                <w:szCs w:val="18"/>
+              </w:rPr>
+              <w:t xml:space="preserve">NOT NULL</w:t>
+            </w:r>
+          </w:p>
+        </w:tc>
+      </w:tr>
+      <w:tr>
+        <w:tc>
+          <w:tcPr>
+            <w:tcW w:type="dxa" w:w="3400"/>
+            <w:shd w:fill="F1F4F9" w:color="auto" w:val="clear"/>
+            <w:tcMar>
+              <w:top w:type="dxa" w:w="40"/>
+              <w:left w:type="dxa" w:w="70"/>
+              <w:bottom w:type="dxa" w:w="40"/>
+              <w:right w:type="dxa" w:w="70"/>
+            </w:tcMar>
+          </w:tcPr>
+          <w:p>
+            <w:pPr>
+              <w:spacing w:after="0" w:line="240"/>
+            </w:pPr>
+            <w:r>
+              <w:rPr>
+                <w:rFonts w:ascii="Calibri" w:cs="Calibri" w:eastAsia="Calibri" w:hAnsi="Calibri"/>
+                <w:b w:val="false"/>
+                <w:bCs w:val="false"/>
+                <w:color w:val="22303F"/>
+                <w:sz w:val="18"/>
+                <w:szCs w:val="18"/>
+              </w:rPr>
+              <w:t xml:space="preserve">Format</w:t>
+            </w:r>
+          </w:p>
+        </w:tc>
+        <w:tc>
+          <w:tcPr>
+            <w:tcW w:type="dxa" w:w="2100"/>
+            <w:shd w:fill="F1F4F9" w:color="auto" w:val="clear"/>
+            <w:tcMar>
+              <w:top w:type="dxa" w:w="40"/>
+              <w:left w:type="dxa" w:w="70"/>
+              <w:bottom w:type="dxa" w:w="40"/>
+              <w:right w:type="dxa" w:w="70"/>
+            </w:tcMar>
+          </w:tcPr>
+          <w:p>
+            <w:pPr>
+              <w:spacing w:after="0" w:line="240"/>
+            </w:pPr>
+            <w:r>
+              <w:rPr>
+                <w:rFonts w:ascii="Calibri" w:cs="Calibri" w:eastAsia="Calibri" w:hAnsi="Calibri"/>
+                <w:b w:val="false"/>
+                <w:bCs w:val="false"/>
+                <w:color w:val="22303F"/>
+                <w:sz w:val="18"/>
+                <w:szCs w:val="18"/>
+              </w:rPr>
+              <w:t xml:space="preserve">enum (int)</w:t>
+            </w:r>
+          </w:p>
+        </w:tc>
+        <w:tc>
+          <w:tcPr>
+            <w:tcW w:type="dxa" w:w="1900"/>
+            <w:shd w:fill="F1F4F9" w:color="auto" w:val="clear"/>
+            <w:tcMar>
+              <w:top w:type="dxa" w:w="40"/>
+              <w:left w:type="dxa" w:w="70"/>
+              <w:bottom w:type="dxa" w:w="40"/>
+              <w:right w:type="dxa" w:w="70"/>
+            </w:tcMar>
+          </w:tcPr>
+          <w:p>
+            <w:pPr>
+              <w:spacing w:after="0" w:line="240"/>
+            </w:pPr>
+            <w:r>
+              <w:rPr>
+                <w:rFonts w:ascii="Calibri" w:cs="Calibri" w:eastAsia="Calibri" w:hAnsi="Calibri"/>
+                <w:b w:val="false"/>
+                <w:bCs w:val="false"/>
+                <w:color w:val="22303F"/>
+                <w:sz w:val="18"/>
+                <w:szCs w:val="18"/>
+              </w:rPr>
+              <w:t xml:space="preserve"/>
+            </w:r>
+          </w:p>
+        </w:tc>
+        <w:tc>
+          <w:tcPr>
+            <w:tcW w:type="dxa" w:w="2100"/>
+            <w:shd w:fill="F1F4F9" w:color="auto" w:val="clear"/>
+            <w:tcMar>
+              <w:top w:type="dxa" w:w="40"/>
+              <w:left w:type="dxa" w:w="70"/>
+              <w:bottom w:type="dxa" w:w="40"/>
+              <w:right w:type="dxa" w:w="70"/>
+            </w:tcMar>
+          </w:tcPr>
+          <w:p>
+            <w:pPr>
+              <w:spacing w:after="0" w:line="240"/>
+            </w:pPr>
+            <w:r>
+              <w:rPr>
+                <w:rFonts w:ascii="Calibri" w:cs="Calibri" w:eastAsia="Calibri" w:hAnsi="Calibri"/>
+                <w:b w:val="false"/>
+                <w:bCs w:val="false"/>
+                <w:color w:val="22303F"/>
+                <w:sz w:val="18"/>
+                <w:szCs w:val="18"/>
+              </w:rPr>
+              <w:t xml:space="preserve">NOT NULL; 0 = Pdf, 1 = Excel</w:t>
+            </w:r>
+          </w:p>
+        </w:tc>
+      </w:tr>
+      <w:tr>
+        <w:tc>
+          <w:tcPr>
+            <w:tcW w:type="dxa" w:w="3400"/>
+            <w:tcMar>
+              <w:top w:type="dxa" w:w="40"/>
+              <w:left w:type="dxa" w:w="70"/>
+              <w:bottom w:type="dxa" w:w="40"/>
+              <w:right w:type="dxa" w:w="70"/>
+            </w:tcMar>
+          </w:tcPr>
+          <w:p>
+            <w:pPr>
+              <w:spacing w:after="0" w:line="240"/>
+            </w:pPr>
+            <w:r>
+              <w:rPr>
+                <w:rFonts w:ascii="Calibri" w:cs="Calibri" w:eastAsia="Calibri" w:hAnsi="Calibri"/>
+                <w:b w:val="false"/>
+                <w:bCs w:val="false"/>
+                <w:color w:val="22303F"/>
+                <w:sz w:val="18"/>
+                <w:szCs w:val="18"/>
+              </w:rPr>
+              <w:t xml:space="preserve">Frequency</w:t>
+            </w:r>
+          </w:p>
+        </w:tc>
+        <w:tc>
+          <w:tcPr>
+            <w:tcW w:type="dxa" w:w="2100"/>
+            <w:tcMar>
+              <w:top w:type="dxa" w:w="40"/>
+              <w:left w:type="dxa" w:w="70"/>
+              <w:bottom w:type="dxa" w:w="40"/>
+              <w:right w:type="dxa" w:w="70"/>
+            </w:tcMar>
+          </w:tcPr>
+          <w:p>
+            <w:pPr>
+              <w:spacing w:after="0" w:line="240"/>
+            </w:pPr>
+            <w:r>
+              <w:rPr>
+                <w:rFonts w:ascii="Calibri" w:cs="Calibri" w:eastAsia="Calibri" w:hAnsi="Calibri"/>
+                <w:b w:val="false"/>
+                <w:bCs w:val="false"/>
+                <w:color w:val="22303F"/>
+                <w:sz w:val="18"/>
+                <w:szCs w:val="18"/>
+              </w:rPr>
+              <w:t xml:space="preserve">enum (int)</w:t>
+            </w:r>
+          </w:p>
+        </w:tc>
+        <w:tc>
+          <w:tcPr>
+            <w:tcW w:type="dxa" w:w="1900"/>
+            <w:tcMar>
+              <w:top w:type="dxa" w:w="40"/>
+              <w:left w:type="dxa" w:w="70"/>
+              <w:bottom w:type="dxa" w:w="40"/>
+              <w:right w:type="dxa" w:w="70"/>
+            </w:tcMar>
+          </w:tcPr>
+          <w:p>
+            <w:pPr>
+              <w:spacing w:after="0" w:line="240"/>
+            </w:pPr>
+            <w:r>
+              <w:rPr>
+                <w:rFonts w:ascii="Calibri" w:cs="Calibri" w:eastAsia="Calibri" w:hAnsi="Calibri"/>
+                <w:b w:val="false"/>
+                <w:bCs w:val="false"/>
+                <w:color w:val="22303F"/>
+                <w:sz w:val="18"/>
+                <w:szCs w:val="18"/>
+              </w:rPr>
+              <w:t xml:space="preserve"/>
+            </w:r>
+          </w:p>
+        </w:tc>
+        <w:tc>
+          <w:tcPr>
+            <w:tcW w:type="dxa" w:w="2100"/>
+            <w:tcMar>
+              <w:top w:type="dxa" w:w="40"/>
+              <w:left w:type="dxa" w:w="70"/>
+              <w:bottom w:type="dxa" w:w="40"/>
+              <w:right w:type="dxa" w:w="70"/>
+            </w:tcMar>
+          </w:tcPr>
+          <w:p>
+            <w:pPr>
+              <w:spacing w:after="0" w:line="240"/>
+            </w:pPr>
+            <w:r>
+              <w:rPr>
+                <w:rFonts w:ascii="Calibri" w:cs="Calibri" w:eastAsia="Calibri" w:hAnsi="Calibri"/>
+                <w:b w:val="false"/>
+                <w:bCs w:val="false"/>
+                <w:color w:val="22303F"/>
+                <w:sz w:val="18"/>
+                <w:szCs w:val="18"/>
+              </w:rPr>
+              <w:t xml:space="preserve">NOT NULL; 0 = Once, 1 = Daily, 2 = Weekly, 3 = Monthly</w:t>
+            </w:r>
+          </w:p>
+        </w:tc>
+      </w:tr>
+      <w:tr>
+        <w:tc>
+          <w:tcPr>
+            <w:tcW w:type="dxa" w:w="3400"/>
+            <w:shd w:fill="F1F4F9" w:color="auto" w:val="clear"/>
+            <w:tcMar>
+              <w:top w:type="dxa" w:w="40"/>
+              <w:left w:type="dxa" w:w="70"/>
+              <w:bottom w:type="dxa" w:w="40"/>
+              <w:right w:type="dxa" w:w="70"/>
+            </w:tcMar>
+          </w:tcPr>
+          <w:p>
+            <w:pPr>
+              <w:spacing w:after="0" w:line="240"/>
+            </w:pPr>
+            <w:r>
+              <w:rPr>
+                <w:rFonts w:ascii="Calibri" w:cs="Calibri" w:eastAsia="Calibri" w:hAnsi="Calibri"/>
+                <w:b w:val="false"/>
+                <w:bCs w:val="false"/>
+                <w:color w:val="22303F"/>
+                <w:sz w:val="18"/>
+                <w:szCs w:val="18"/>
+              </w:rPr>
+              <w:t xml:space="preserve">NextRunUtc</w:t>
+            </w:r>
+          </w:p>
+        </w:tc>
+        <w:tc>
+          <w:tcPr>
+            <w:tcW w:type="dxa" w:w="2100"/>
+            <w:shd w:fill="F1F4F9" w:color="auto" w:val="clear"/>
+            <w:tcMar>
+              <w:top w:type="dxa" w:w="40"/>
+              <w:left w:type="dxa" w:w="70"/>
+              <w:bottom w:type="dxa" w:w="40"/>
+              <w:right w:type="dxa" w:w="70"/>
+            </w:tcMar>
+          </w:tcPr>
+          <w:p>
+            <w:pPr>
+              <w:spacing w:after="0" w:line="240"/>
+            </w:pPr>
+            <w:r>
+              <w:rPr>
+                <w:rFonts w:ascii="Calibri" w:cs="Calibri" w:eastAsia="Calibri" w:hAnsi="Calibri"/>
+                <w:b w:val="false"/>
+                <w:bCs w:val="false"/>
+                <w:color w:val="22303F"/>
+                <w:sz w:val="18"/>
+                <w:szCs w:val="18"/>
+              </w:rPr>
+              <w:t xml:space="preserve">DateTime</w:t>
+            </w:r>
+          </w:p>
+        </w:tc>
+        <w:tc>
+          <w:tcPr>
+            <w:tcW w:type="dxa" w:w="1900"/>
+            <w:shd w:fill="F1F4F9" w:color="auto" w:val="clear"/>
+            <w:tcMar>
+              <w:top w:type="dxa" w:w="40"/>
+              <w:left w:type="dxa" w:w="70"/>
+              <w:bottom w:type="dxa" w:w="40"/>
+              <w:right w:type="dxa" w:w="70"/>
+            </w:tcMar>
+          </w:tcPr>
+          <w:p>
+            <w:pPr>
+              <w:spacing w:after="0" w:line="240"/>
+            </w:pPr>
+            <w:r>
+              <w:rPr>
+                <w:rFonts w:ascii="Calibri" w:cs="Calibri" w:eastAsia="Calibri" w:hAnsi="Calibri"/>
+                <w:b w:val="false"/>
+                <w:bCs w:val="false"/>
+                <w:color w:val="22303F"/>
+                <w:sz w:val="18"/>
+                <w:szCs w:val="18"/>
+              </w:rPr>
+              <w:t xml:space="preserve"/>
+            </w:r>
+          </w:p>
+        </w:tc>
+        <w:tc>
+          <w:tcPr>
+            <w:tcW w:type="dxa" w:w="2100"/>
+            <w:shd w:fill="F1F4F9" w:color="auto" w:val="clear"/>
+            <w:tcMar>
+              <w:top w:type="dxa" w:w="40"/>
+              <w:left w:type="dxa" w:w="70"/>
+              <w:bottom w:type="dxa" w:w="40"/>
+              <w:right w:type="dxa" w:w="70"/>
+            </w:tcMar>
+          </w:tcPr>
+          <w:p>
+            <w:pPr>
+              <w:spacing w:after="0" w:line="240"/>
+            </w:pPr>
+            <w:r>
+              <w:rPr>
+                <w:rFonts w:ascii="Calibri" w:cs="Calibri" w:eastAsia="Calibri" w:hAnsi="Calibri"/>
+                <w:b w:val="false"/>
+                <w:bCs w:val="false"/>
+                <w:color w:val="22303F"/>
+                <w:sz w:val="18"/>
+                <w:szCs w:val="18"/>
+              </w:rPr>
+              <w:t xml:space="preserve">NOT NULL; stored in UTC, advanced after each run</w:t>
+            </w:r>
+          </w:p>
+        </w:tc>
+      </w:tr>
+      <w:tr>
+        <w:tc>
+          <w:tcPr>
+            <w:tcW w:type="dxa" w:w="3400"/>
+            <w:tcMar>
+              <w:top w:type="dxa" w:w="40"/>
+              <w:left w:type="dxa" w:w="70"/>
+              <w:bottom w:type="dxa" w:w="40"/>
+              <w:right w:type="dxa" w:w="70"/>
+            </w:tcMar>
+          </w:tcPr>
+          <w:p>
+            <w:pPr>
+              <w:spacing w:after="0" w:line="240"/>
+            </w:pPr>
+            <w:r>
+              <w:rPr>
+                <w:rFonts w:ascii="Calibri" w:cs="Calibri" w:eastAsia="Calibri" w:hAnsi="Calibri"/>
+                <w:b w:val="false"/>
+                <w:bCs w:val="false"/>
+                <w:color w:val="22303F"/>
+                <w:sz w:val="18"/>
+                <w:szCs w:val="18"/>
+              </w:rPr>
+              <w:t xml:space="preserve">IsActive</w:t>
+            </w:r>
+          </w:p>
+        </w:tc>
+        <w:tc>
+          <w:tcPr>
+            <w:tcW w:type="dxa" w:w="2100"/>
+            <w:tcMar>
+              <w:top w:type="dxa" w:w="40"/>
+              <w:left w:type="dxa" w:w="70"/>
+              <w:bottom w:type="dxa" w:w="40"/>
+              <w:right w:type="dxa" w:w="70"/>
+            </w:tcMar>
+          </w:tcPr>
+          <w:p>
+            <w:pPr>
+              <w:spacing w:after="0" w:line="240"/>
+            </w:pPr>
+            <w:r>
+              <w:rPr>
+                <w:rFonts w:ascii="Calibri" w:cs="Calibri" w:eastAsia="Calibri" w:hAnsi="Calibri"/>
+                <w:b w:val="false"/>
+                <w:bCs w:val="false"/>
+                <w:color w:val="22303F"/>
+                <w:sz w:val="18"/>
+                <w:szCs w:val="18"/>
+              </w:rPr>
+              <w:t xml:space="preserve">bool</w:t>
+            </w:r>
+          </w:p>
+        </w:tc>
+        <w:tc>
+          <w:tcPr>
+            <w:tcW w:type="dxa" w:w="1900"/>
+            <w:tcMar>
+              <w:top w:type="dxa" w:w="40"/>
+              <w:left w:type="dxa" w:w="70"/>
+              <w:bottom w:type="dxa" w:w="40"/>
+              <w:right w:type="dxa" w:w="70"/>
+            </w:tcMar>
+          </w:tcPr>
+          <w:p>
+            <w:pPr>
+              <w:spacing w:after="0" w:line="240"/>
+            </w:pPr>
+            <w:r>
+              <w:rPr>
+                <w:rFonts w:ascii="Calibri" w:cs="Calibri" w:eastAsia="Calibri" w:hAnsi="Calibri"/>
+                <w:b w:val="false"/>
+                <w:bCs w:val="false"/>
+                <w:color w:val="22303F"/>
+                <w:sz w:val="18"/>
+                <w:szCs w:val="18"/>
+              </w:rPr>
+              <w:t xml:space="preserve"/>
+            </w:r>
+          </w:p>
+        </w:tc>
+        <w:tc>
+          <w:tcPr>
+            <w:tcW w:type="dxa" w:w="2100"/>
+            <w:tcMar>
+              <w:top w:type="dxa" w:w="40"/>
+              <w:left w:type="dxa" w:w="70"/>
+              <w:bottom w:type="dxa" w:w="40"/>
+              <w:right w:type="dxa" w:w="70"/>
+            </w:tcMar>
+          </w:tcPr>
+          <w:p>
+            <w:pPr>
+              <w:spacing w:after="0" w:line="240"/>
+            </w:pPr>
+            <w:r>
+              <w:rPr>
+                <w:rFonts w:ascii="Calibri" w:cs="Calibri" w:eastAsia="Calibri" w:hAnsi="Calibri"/>
+                <w:b w:val="false"/>
+                <w:bCs w:val="false"/>
+                <w:color w:val="22303F"/>
+                <w:sz w:val="18"/>
+                <w:szCs w:val="18"/>
+              </w:rPr>
+              <w:t xml:space="preserve">NOT NULL; only active schedules fire</w:t>
+            </w:r>
+          </w:p>
+        </w:tc>
+      </w:tr>
+      <w:tr>
+        <w:tc>
+          <w:tcPr>
+            <w:tcW w:type="dxa" w:w="3400"/>
+            <w:shd w:fill="F1F4F9" w:color="auto" w:val="clear"/>
+            <w:tcMar>
+              <w:top w:type="dxa" w:w="40"/>
+              <w:left w:type="dxa" w:w="70"/>
+              <w:bottom w:type="dxa" w:w="40"/>
+              <w:right w:type="dxa" w:w="70"/>
+            </w:tcMar>
+          </w:tcPr>
+          <w:p>
+            <w:pPr>
+              <w:spacing w:after="0" w:line="240"/>
+            </w:pPr>
+            <w:r>
+              <w:rPr>
+                <w:rFonts w:ascii="Calibri" w:cs="Calibri" w:eastAsia="Calibri" w:hAnsi="Calibri"/>
+                <w:b w:val="false"/>
+                <w:bCs w:val="false"/>
+                <w:color w:val="22303F"/>
+                <w:sz w:val="18"/>
+                <w:szCs w:val="18"/>
+              </w:rPr>
+              <w:t xml:space="preserve">BusinessUnitId</w:t>
+            </w:r>
+          </w:p>
+        </w:tc>
+        <w:tc>
+          <w:tcPr>
+            <w:tcW w:type="dxa" w:w="2100"/>
+            <w:shd w:fill="F1F4F9" w:color="auto" w:val="clear"/>
+            <w:tcMar>
+              <w:top w:type="dxa" w:w="40"/>
+              <w:left w:type="dxa" w:w="70"/>
+              <w:bottom w:type="dxa" w:w="40"/>
+              <w:right w:type="dxa" w:w="70"/>
+            </w:tcMar>
+          </w:tcPr>
+          <w:p>
+            <w:pPr>
+              <w:spacing w:after="0" w:line="240"/>
+            </w:pPr>
+            <w:r>
+              <w:rPr>
+                <w:rFonts w:ascii="Calibri" w:cs="Calibri" w:eastAsia="Calibri" w:hAnsi="Calibri"/>
+                <w:b w:val="false"/>
+                <w:bCs w:val="false"/>
+                <w:color w:val="22303F"/>
+                <w:sz w:val="18"/>
+                <w:szCs w:val="18"/>
+              </w:rPr>
+              <w:t xml:space="preserve">int?</w:t>
+            </w:r>
+          </w:p>
+        </w:tc>
+        <w:tc>
+          <w:tcPr>
+            <w:tcW w:type="dxa" w:w="1900"/>
+            <w:shd w:fill="F1F4F9" w:color="auto" w:val="clear"/>
+            <w:tcMar>
+              <w:top w:type="dxa" w:w="40"/>
+              <w:left w:type="dxa" w:w="70"/>
+              <w:bottom w:type="dxa" w:w="40"/>
+              <w:right w:type="dxa" w:w="70"/>
+            </w:tcMar>
+          </w:tcPr>
+          <w:p>
+            <w:pPr>
+              <w:spacing w:after="0" w:line="240"/>
+            </w:pPr>
+            <w:r>
+              <w:rPr>
+                <w:rFonts w:ascii="Calibri" w:cs="Calibri" w:eastAsia="Calibri" w:hAnsi="Calibri"/>
+                <w:b w:val="false"/>
+                <w:bCs w:val="false"/>
+                <w:color w:val="22303F"/>
+                <w:sz w:val="18"/>
+                <w:szCs w:val="18"/>
+              </w:rPr>
+              <w:t xml:space="preserve"/>
+            </w:r>
+          </w:p>
+        </w:tc>
+        <w:tc>
+          <w:tcPr>
+            <w:tcW w:type="dxa" w:w="2100"/>
+            <w:shd w:fill="F1F4F9" w:color="auto" w:val="clear"/>
+            <w:tcMar>
+              <w:top w:type="dxa" w:w="40"/>
+              <w:left w:type="dxa" w:w="70"/>
+              <w:bottom w:type="dxa" w:w="40"/>
+              <w:right w:type="dxa" w:w="70"/>
+            </w:tcMar>
+          </w:tcPr>
+          <w:p>
+            <w:pPr>
+              <w:spacing w:after="0" w:line="240"/>
+            </w:pPr>
+            <w:r>
+              <w:rPr>
+                <w:rFonts w:ascii="Calibri" w:cs="Calibri" w:eastAsia="Calibri" w:hAnsi="Calibri"/>
+                <w:b w:val="false"/>
+                <w:bCs w:val="false"/>
+                <w:color w:val="22303F"/>
+                <w:sz w:val="18"/>
+                <w:szCs w:val="18"/>
+              </w:rPr>
+              <w:t xml:space="preserve">Optional BU scope; null = all suppliers</w:t>
+            </w:r>
+          </w:p>
+        </w:tc>
+      </w:tr>
+      <w:tr>
+        <w:tc>
+          <w:tcPr>
+            <w:tcW w:type="dxa" w:w="3400"/>
+            <w:tcMar>
+              <w:top w:type="dxa" w:w="40"/>
+              <w:left w:type="dxa" w:w="70"/>
+              <w:bottom w:type="dxa" w:w="40"/>
+              <w:right w:type="dxa" w:w="70"/>
+            </w:tcMar>
+          </w:tcPr>
+          <w:p>
+            <w:pPr>
+              <w:spacing w:after="0" w:line="240"/>
+            </w:pPr>
+            <w:r>
+              <w:rPr>
+                <w:rFonts w:ascii="Calibri" w:cs="Calibri" w:eastAsia="Calibri" w:hAnsi="Calibri"/>
+                <w:b w:val="false"/>
+                <w:bCs w:val="false"/>
+                <w:color w:val="22303F"/>
+                <w:sz w:val="18"/>
+                <w:szCs w:val="18"/>
+              </w:rPr>
+              <w:t xml:space="preserve">NotificationGroupId</w:t>
+            </w:r>
+          </w:p>
+        </w:tc>
+        <w:tc>
+          <w:tcPr>
+            <w:tcW w:type="dxa" w:w="2100"/>
+            <w:tcMar>
+              <w:top w:type="dxa" w:w="40"/>
+              <w:left w:type="dxa" w:w="70"/>
+              <w:bottom w:type="dxa" w:w="40"/>
+              <w:right w:type="dxa" w:w="70"/>
+            </w:tcMar>
+          </w:tcPr>
+          <w:p>
+            <w:pPr>
+              <w:spacing w:after="0" w:line="240"/>
+            </w:pPr>
+            <w:r>
+              <w:rPr>
+                <w:rFonts w:ascii="Calibri" w:cs="Calibri" w:eastAsia="Calibri" w:hAnsi="Calibri"/>
+                <w:b w:val="false"/>
+                <w:bCs w:val="false"/>
+                <w:color w:val="22303F"/>
+                <w:sz w:val="18"/>
+                <w:szCs w:val="18"/>
+              </w:rPr>
+              <w:t xml:space="preserve">int</w:t>
+            </w:r>
+          </w:p>
+        </w:tc>
+        <w:tc>
+          <w:tcPr>
+            <w:tcW w:type="dxa" w:w="1900"/>
+            <w:tcMar>
+              <w:top w:type="dxa" w:w="40"/>
+              <w:left w:type="dxa" w:w="70"/>
+              <w:bottom w:type="dxa" w:w="40"/>
+              <w:right w:type="dxa" w:w="70"/>
+            </w:tcMar>
+          </w:tcPr>
+          <w:p>
+            <w:pPr>
+              <w:spacing w:after="0" w:line="240"/>
+            </w:pPr>
+            <w:r>
+              <w:rPr>
+                <w:rFonts w:ascii="Calibri" w:cs="Calibri" w:eastAsia="Calibri" w:hAnsi="Calibri"/>
+                <w:b w:val="false"/>
+                <w:bCs w:val="false"/>
+                <w:color w:val="22303F"/>
+                <w:sz w:val="18"/>
+                <w:szCs w:val="18"/>
+              </w:rPr>
+              <w:t xml:space="preserve">FK → NotificationGroup</w:t>
+            </w:r>
+          </w:p>
+        </w:tc>
+        <w:tc>
+          <w:tcPr>
+            <w:tcW w:type="dxa" w:w="2100"/>
+            <w:tcMar>
+              <w:top w:type="dxa" w:w="40"/>
+              <w:left w:type="dxa" w:w="70"/>
+              <w:bottom w:type="dxa" w:w="40"/>
+              <w:right w:type="dxa" w:w="70"/>
+            </w:tcMar>
+          </w:tcPr>
+          <w:p>
+            <w:pPr>
+              <w:spacing w:after="0" w:line="240"/>
+            </w:pPr>
+            <w:r>
+              <w:rPr>
+                <w:rFonts w:ascii="Calibri" w:cs="Calibri" w:eastAsia="Calibri" w:hAnsi="Calibri"/>
+                <w:b w:val="false"/>
+                <w:bCs w:val="false"/>
+                <w:color w:val="22303F"/>
+                <w:sz w:val="18"/>
+                <w:szCs w:val="18"/>
+              </w:rPr>
+              <w:t xml:space="preserve">NOT NULL; recipient group; ON DELETE CASCADE; index</w:t>
+            </w:r>
+          </w:p>
+        </w:tc>
+      </w:tr>
+      <w:tr>
+        <w:tc>
+          <w:tcPr>
+            <w:tcW w:type="dxa" w:w="3400"/>
+            <w:shd w:fill="F1F4F9" w:color="auto" w:val="clear"/>
+            <w:tcMar>
+              <w:top w:type="dxa" w:w="40"/>
+              <w:left w:type="dxa" w:w="70"/>
+              <w:bottom w:type="dxa" w:w="40"/>
+              <w:right w:type="dxa" w:w="70"/>
+            </w:tcMar>
+          </w:tcPr>
+          <w:p>
+            <w:pPr>
+              <w:spacing w:after="0" w:line="240"/>
+            </w:pPr>
+            <w:r>
+              <w:rPr>
+                <w:rFonts w:ascii="Calibri" w:cs="Calibri" w:eastAsia="Calibri" w:hAnsi="Calibri"/>
+                <w:b w:val="false"/>
+                <w:bCs w:val="false"/>
+                <w:color w:val="22303F"/>
+                <w:sz w:val="18"/>
+                <w:szCs w:val="18"/>
+              </w:rPr>
+              <w:t xml:space="preserve">CreatedAt</w:t>
+            </w:r>
+          </w:p>
+        </w:tc>
+        <w:tc>
+          <w:tcPr>
+            <w:tcW w:type="dxa" w:w="2100"/>
+            <w:shd w:fill="F1F4F9" w:color="auto" w:val="clear"/>
+            <w:tcMar>
+              <w:top w:type="dxa" w:w="40"/>
+              <w:left w:type="dxa" w:w="70"/>
+              <w:bottom w:type="dxa" w:w="40"/>
+              <w:right w:type="dxa" w:w="70"/>
+            </w:tcMar>
+          </w:tcPr>
+          <w:p>
+            <w:pPr>
+              <w:spacing w:after="0" w:line="240"/>
+            </w:pPr>
+            <w:r>
+              <w:rPr>
+                <w:rFonts w:ascii="Calibri" w:cs="Calibri" w:eastAsia="Calibri" w:hAnsi="Calibri"/>
+                <w:b w:val="false"/>
+                <w:bCs w:val="false"/>
+                <w:color w:val="22303F"/>
+                <w:sz w:val="18"/>
+                <w:szCs w:val="18"/>
+              </w:rPr>
+              <w:t xml:space="preserve">DateTime</w:t>
+            </w:r>
+          </w:p>
+        </w:tc>
+        <w:tc>
+          <w:tcPr>
+            <w:tcW w:type="dxa" w:w="1900"/>
+            <w:shd w:fill="F1F4F9" w:color="auto" w:val="clear"/>
+            <w:tcMar>
+              <w:top w:type="dxa" w:w="40"/>
+              <w:left w:type="dxa" w:w="70"/>
+              <w:bottom w:type="dxa" w:w="40"/>
+              <w:right w:type="dxa" w:w="70"/>
+            </w:tcMar>
+          </w:tcPr>
+          <w:p>
+            <w:pPr>
+              <w:spacing w:after="0" w:line="240"/>
+            </w:pPr>
+            <w:r>
+              <w:rPr>
+                <w:rFonts w:ascii="Calibri" w:cs="Calibri" w:eastAsia="Calibri" w:hAnsi="Calibri"/>
+                <w:b w:val="false"/>
+                <w:bCs w:val="false"/>
+                <w:color w:val="22303F"/>
+                <w:sz w:val="18"/>
+                <w:szCs w:val="18"/>
+              </w:rPr>
+              <w:t xml:space="preserve"/>
+            </w:r>
+          </w:p>
+        </w:tc>
+        <w:tc>
+          <w:tcPr>
+            <w:tcW w:type="dxa" w:w="2100"/>
+            <w:shd w:fill="F1F4F9" w:color="auto" w:val="clear"/>
+            <w:tcMar>
+              <w:top w:type="dxa" w:w="40"/>
+              <w:left w:type="dxa" w:w="70"/>
+              <w:bottom w:type="dxa" w:w="40"/>
+              <w:right w:type="dxa" w:w="70"/>
+            </w:tcMar>
+          </w:tcPr>
+          <w:p>
+            <w:pPr>
+              <w:spacing w:after="0" w:line="240"/>
+            </w:pPr>
+            <w:r>
+              <w:rPr>
+                <w:rFonts w:ascii="Calibri" w:cs="Calibri" w:eastAsia="Calibri" w:hAnsi="Calibri"/>
+                <w:b w:val="false"/>
+                <w:bCs w:val="false"/>
+                <w:color w:val="22303F"/>
+                <w:sz w:val="18"/>
+                <w:szCs w:val="18"/>
+              </w:rPr>
+              <w:t xml:space="preserve"/>
+            </w:r>
+          </w:p>
+        </w:tc>
+      </w:tr>
+      <w:tr>
+        <w:tc>
+          <w:tcPr>
+            <w:tcW w:type="dxa" w:w="3400"/>
+            <w:tcMar>
+              <w:top w:type="dxa" w:w="40"/>
+              <w:left w:type="dxa" w:w="70"/>
+              <w:bottom w:type="dxa" w:w="40"/>
+              <w:right w:type="dxa" w:w="70"/>
+            </w:tcMar>
+          </w:tcPr>
+          <w:p>
+            <w:pPr>
+              <w:spacing w:after="0" w:line="240"/>
+            </w:pPr>
+            <w:r>
+              <w:rPr>
+                <w:rFonts w:ascii="Calibri" w:cs="Calibri" w:eastAsia="Calibri" w:hAnsi="Calibri"/>
+                <w:b w:val="false"/>
+                <w:bCs w:val="false"/>
+                <w:color w:val="22303F"/>
+                <w:sz w:val="18"/>
+                <w:szCs w:val="18"/>
+              </w:rPr>
+              <w:t xml:space="preserve">CreatedBy</w:t>
+            </w:r>
+          </w:p>
+        </w:tc>
+        <w:tc>
+          <w:tcPr>
+            <w:tcW w:type="dxa" w:w="2100"/>
+            <w:tcMar>
+              <w:top w:type="dxa" w:w="40"/>
+              <w:left w:type="dxa" w:w="70"/>
+              <w:bottom w:type="dxa" w:w="40"/>
+              <w:right w:type="dxa" w:w="70"/>
+            </w:tcMar>
+          </w:tcPr>
+          <w:p>
+            <w:pPr>
+              <w:spacing w:after="0" w:line="240"/>
+            </w:pPr>
+            <w:r>
+              <w:rPr>
+                <w:rFonts w:ascii="Calibri" w:cs="Calibri" w:eastAsia="Calibri" w:hAnsi="Calibri"/>
+                <w:b w:val="false"/>
+                <w:bCs w:val="false"/>
+                <w:color w:val="22303F"/>
+                <w:sz w:val="18"/>
+                <w:szCs w:val="18"/>
+              </w:rPr>
+              <w:t xml:space="preserve">string(150)?</w:t>
+            </w:r>
+          </w:p>
+        </w:tc>
+        <w:tc>
+          <w:tcPr>
+            <w:tcW w:type="dxa" w:w="1900"/>
+            <w:tcMar>
+              <w:top w:type="dxa" w:w="40"/>
+              <w:left w:type="dxa" w:w="70"/>
+              <w:bottom w:type="dxa" w:w="40"/>
+              <w:right w:type="dxa" w:w="70"/>
+            </w:tcMar>
+          </w:tcPr>
+          <w:p>
+            <w:pPr>
+              <w:spacing w:after="0" w:line="240"/>
+            </w:pPr>
+            <w:r>
+              <w:rPr>
+                <w:rFonts w:ascii="Calibri" w:cs="Calibri" w:eastAsia="Calibri" w:hAnsi="Calibri"/>
+                <w:b w:val="false"/>
+                <w:bCs w:val="false"/>
+                <w:color w:val="22303F"/>
+                <w:sz w:val="18"/>
+                <w:szCs w:val="18"/>
+              </w:rPr>
+              <w:t xml:space="preserve"/>
+            </w:r>
+          </w:p>
+        </w:tc>
+        <w:tc>
+          <w:tcPr>
+            <w:tcW w:type="dxa" w:w="2100"/>
+            <w:tcMar>
+              <w:top w:type="dxa" w:w="40"/>
+              <w:left w:type="dxa" w:w="70"/>
+              <w:bottom w:type="dxa" w:w="40"/>
+              <w:right w:type="dxa" w:w="70"/>
+            </w:tcMar>
+          </w:tcPr>
+          <w:p>
+            <w:pPr>
+              <w:spacing w:after="0" w:line="240"/>
+            </w:pPr>
+            <w:r>
+              <w:rPr>
+                <w:rFonts w:ascii="Calibri" w:cs="Calibri" w:eastAsia="Calibri" w:hAnsi="Calibri"/>
+                <w:b w:val="false"/>
+                <w:bCs w:val="false"/>
+                <w:color w:val="22303F"/>
+                <w:sz w:val="18"/>
+                <w:szCs w:val="18"/>
+              </w:rPr>
+              <w:t xml:space="preserve"/>
+            </w:r>
+          </w:p>
+        </w:tc>
+      </w:tr>
+      <w:tr>
+        <w:tc>
+          <w:tcPr>
+            <w:tcW w:type="dxa" w:w="3400"/>
+            <w:shd w:fill="F1F4F9" w:color="auto" w:val="clear"/>
+            <w:tcMar>
+              <w:top w:type="dxa" w:w="40"/>
+              <w:left w:type="dxa" w:w="70"/>
+              <w:bottom w:type="dxa" w:w="40"/>
+              <w:right w:type="dxa" w:w="70"/>
+            </w:tcMar>
+          </w:tcPr>
+          <w:p>
+            <w:pPr>
+              <w:spacing w:after="0" w:line="240"/>
+            </w:pPr>
+            <w:r>
+              <w:rPr>
+                <w:rFonts w:ascii="Calibri" w:cs="Calibri" w:eastAsia="Calibri" w:hAnsi="Calibri"/>
+                <w:b w:val="false"/>
+                <w:bCs w:val="false"/>
+                <w:color w:val="22303F"/>
+                <w:sz w:val="18"/>
+                <w:szCs w:val="18"/>
+              </w:rPr>
+              <w:t xml:space="preserve">LastRunUtc</w:t>
+            </w:r>
+          </w:p>
+        </w:tc>
+        <w:tc>
+          <w:tcPr>
+            <w:tcW w:type="dxa" w:w="2100"/>
+            <w:shd w:fill="F1F4F9" w:color="auto" w:val="clear"/>
+            <w:tcMar>
+              <w:top w:type="dxa" w:w="40"/>
+              <w:left w:type="dxa" w:w="70"/>
+              <w:bottom w:type="dxa" w:w="40"/>
+              <w:right w:type="dxa" w:w="70"/>
+            </w:tcMar>
+          </w:tcPr>
+          <w:p>
+            <w:pPr>
+              <w:spacing w:after="0" w:line="240"/>
+            </w:pPr>
+            <w:r>
+              <w:rPr>
+                <w:rFonts w:ascii="Calibri" w:cs="Calibri" w:eastAsia="Calibri" w:hAnsi="Calibri"/>
+                <w:b w:val="false"/>
+                <w:bCs w:val="false"/>
+                <w:color w:val="22303F"/>
+                <w:sz w:val="18"/>
+                <w:szCs w:val="18"/>
+              </w:rPr>
+              <w:t xml:space="preserve">DateTime?</w:t>
+            </w:r>
+          </w:p>
+        </w:tc>
+        <w:tc>
+          <w:tcPr>
+            <w:tcW w:type="dxa" w:w="1900"/>
+            <w:shd w:fill="F1F4F9" w:color="auto" w:val="clear"/>
+            <w:tcMar>
+              <w:top w:type="dxa" w:w="40"/>
+              <w:left w:type="dxa" w:w="70"/>
+              <w:bottom w:type="dxa" w:w="40"/>
+              <w:right w:type="dxa" w:w="70"/>
+            </w:tcMar>
+          </w:tcPr>
+          <w:p>
+            <w:pPr>
+              <w:spacing w:after="0" w:line="240"/>
+            </w:pPr>
+            <w:r>
+              <w:rPr>
+                <w:rFonts w:ascii="Calibri" w:cs="Calibri" w:eastAsia="Calibri" w:hAnsi="Calibri"/>
+                <w:b w:val="false"/>
+                <w:bCs w:val="false"/>
+                <w:color w:val="22303F"/>
+                <w:sz w:val="18"/>
+                <w:szCs w:val="18"/>
+              </w:rPr>
+              <w:t xml:space="preserve"/>
+            </w:r>
+          </w:p>
+        </w:tc>
+        <w:tc>
+          <w:tcPr>
+            <w:tcW w:type="dxa" w:w="2100"/>
+            <w:shd w:fill="F1F4F9" w:color="auto" w:val="clear"/>
+            <w:tcMar>
+              <w:top w:type="dxa" w:w="40"/>
+              <w:left w:type="dxa" w:w="70"/>
+              <w:bottom w:type="dxa" w:w="40"/>
+              <w:right w:type="dxa" w:w="70"/>
+            </w:tcMar>
+          </w:tcPr>
+          <w:p>
+            <w:pPr>
+              <w:spacing w:after="0" w:line="240"/>
+            </w:pPr>
+            <w:r>
+              <w:rPr>
+                <w:rFonts w:ascii="Calibri" w:cs="Calibri" w:eastAsia="Calibri" w:hAnsi="Calibri"/>
+                <w:b w:val="false"/>
+                <w:bCs w:val="false"/>
+                <w:color w:val="22303F"/>
+                <w:sz w:val="18"/>
+                <w:szCs w:val="18"/>
+              </w:rPr>
+              <w:t xml:space="preserve">Last attempt (UTC), or null</w:t>
+            </w:r>
+          </w:p>
+        </w:tc>
+      </w:tr>
+      <w:tr>
+        <w:tc>
+          <w:tcPr>
+            <w:tcW w:type="dxa" w:w="3400"/>
+            <w:tcMar>
+              <w:top w:type="dxa" w:w="40"/>
+              <w:left w:type="dxa" w:w="70"/>
+              <w:bottom w:type="dxa" w:w="40"/>
+              <w:right w:type="dxa" w:w="70"/>
+            </w:tcMar>
+          </w:tcPr>
+          <w:p>
+            <w:pPr>
+              <w:spacing w:after="0" w:line="240"/>
+            </w:pPr>
+            <w:r>
+              <w:rPr>
+                <w:rFonts w:ascii="Calibri" w:cs="Calibri" w:eastAsia="Calibri" w:hAnsi="Calibri"/>
+                <w:b w:val="false"/>
+                <w:bCs w:val="false"/>
+                <w:color w:val="22303F"/>
+                <w:sz w:val="18"/>
+                <w:szCs w:val="18"/>
+              </w:rPr>
+              <w:t xml:space="preserve">LastRunStatus</w:t>
+            </w:r>
+          </w:p>
+        </w:tc>
+        <w:tc>
+          <w:tcPr>
+            <w:tcW w:type="dxa" w:w="2100"/>
+            <w:tcMar>
+              <w:top w:type="dxa" w:w="40"/>
+              <w:left w:type="dxa" w:w="70"/>
+              <w:bottom w:type="dxa" w:w="40"/>
+              <w:right w:type="dxa" w:w="70"/>
+            </w:tcMar>
+          </w:tcPr>
+          <w:p>
+            <w:pPr>
+              <w:spacing w:after="0" w:line="240"/>
+            </w:pPr>
+            <w:r>
+              <w:rPr>
+                <w:rFonts w:ascii="Calibri" w:cs="Calibri" w:eastAsia="Calibri" w:hAnsi="Calibri"/>
+                <w:b w:val="false"/>
+                <w:bCs w:val="false"/>
+                <w:color w:val="22303F"/>
+                <w:sz w:val="18"/>
+                <w:szCs w:val="18"/>
+              </w:rPr>
+              <w:t xml:space="preserve">string(40)?</w:t>
+            </w:r>
+          </w:p>
+        </w:tc>
+        <w:tc>
+          <w:tcPr>
+            <w:tcW w:type="dxa" w:w="1900"/>
+            <w:tcMar>
+              <w:top w:type="dxa" w:w="40"/>
+              <w:left w:type="dxa" w:w="70"/>
+              <w:bottom w:type="dxa" w:w="40"/>
+              <w:right w:type="dxa" w:w="70"/>
+            </w:tcMar>
+          </w:tcPr>
+          <w:p>
+            <w:pPr>
+              <w:spacing w:after="0" w:line="240"/>
+            </w:pPr>
+            <w:r>
+              <w:rPr>
+                <w:rFonts w:ascii="Calibri" w:cs="Calibri" w:eastAsia="Calibri" w:hAnsi="Calibri"/>
+                <w:b w:val="false"/>
+                <w:bCs w:val="false"/>
+                <w:color w:val="22303F"/>
+                <w:sz w:val="18"/>
+                <w:szCs w:val="18"/>
+              </w:rPr>
+              <w:t xml:space="preserve"/>
+            </w:r>
+          </w:p>
+        </w:tc>
+        <w:tc>
+          <w:tcPr>
+            <w:tcW w:type="dxa" w:w="2100"/>
+            <w:tcMar>
+              <w:top w:type="dxa" w:w="40"/>
+              <w:left w:type="dxa" w:w="70"/>
+              <w:bottom w:type="dxa" w:w="40"/>
+              <w:right w:type="dxa" w:w="70"/>
+            </w:tcMar>
+          </w:tcPr>
+          <w:p>
+            <w:pPr>
+              <w:spacing w:after="0" w:line="240"/>
+            </w:pPr>
+            <w:r>
+              <w:rPr>
+                <w:rFonts w:ascii="Calibri" w:cs="Calibri" w:eastAsia="Calibri" w:hAnsi="Calibri"/>
+                <w:b w:val="false"/>
+                <w:bCs w:val="false"/>
+                <w:color w:val="22303F"/>
+                <w:sz w:val="18"/>
+                <w:szCs w:val="18"/>
+              </w:rPr>
+              <w:t xml:space="preserve">e.g. Sent / Skipped / Failed</w:t>
+            </w:r>
+          </w:p>
+        </w:tc>
+      </w:tr>
+      <w:tr>
+        <w:tc>
+          <w:tcPr>
+            <w:tcW w:type="dxa" w:w="3400"/>
+            <w:shd w:fill="F1F4F9" w:color="auto" w:val="clear"/>
+            <w:tcMar>
+              <w:top w:type="dxa" w:w="40"/>
+              <w:left w:type="dxa" w:w="70"/>
+              <w:bottom w:type="dxa" w:w="40"/>
+              <w:right w:type="dxa" w:w="70"/>
+            </w:tcMar>
+          </w:tcPr>
+          <w:p>
+            <w:pPr>
+              <w:spacing w:after="0" w:line="240"/>
+            </w:pPr>
+            <w:r>
+              <w:rPr>
+                <w:rFonts w:ascii="Calibri" w:cs="Calibri" w:eastAsia="Calibri" w:hAnsi="Calibri"/>
+                <w:b w:val="false"/>
+                <w:bCs w:val="false"/>
+                <w:color w:val="22303F"/>
+                <w:sz w:val="18"/>
+                <w:szCs w:val="18"/>
+              </w:rPr>
+              <w:t xml:space="preserve">LastRunDetail</w:t>
+            </w:r>
+          </w:p>
+        </w:tc>
+        <w:tc>
+          <w:tcPr>
+            <w:tcW w:type="dxa" w:w="2100"/>
+            <w:shd w:fill="F1F4F9" w:color="auto" w:val="clear"/>
+            <w:tcMar>
+              <w:top w:type="dxa" w:w="40"/>
+              <w:left w:type="dxa" w:w="70"/>
+              <w:bottom w:type="dxa" w:w="40"/>
+              <w:right w:type="dxa" w:w="70"/>
+            </w:tcMar>
+          </w:tcPr>
+          <w:p>
+            <w:pPr>
+              <w:spacing w:after="0" w:line="240"/>
+            </w:pPr>
+            <w:r>
+              <w:rPr>
+                <w:rFonts w:ascii="Calibri" w:cs="Calibri" w:eastAsia="Calibri" w:hAnsi="Calibri"/>
+                <w:b w:val="false"/>
+                <w:bCs w:val="false"/>
+                <w:color w:val="22303F"/>
+                <w:sz w:val="18"/>
+                <w:szCs w:val="18"/>
+              </w:rPr>
+              <w:t xml:space="preserve">string(1000)?</w:t>
+            </w:r>
+          </w:p>
+        </w:tc>
+        <w:tc>
+          <w:tcPr>
+            <w:tcW w:type="dxa" w:w="1900"/>
+            <w:shd w:fill="F1F4F9" w:color="auto" w:val="clear"/>
+            <w:tcMar>
+              <w:top w:type="dxa" w:w="40"/>
+              <w:left w:type="dxa" w:w="70"/>
+              <w:bottom w:type="dxa" w:w="40"/>
+              <w:right w:type="dxa" w:w="70"/>
+            </w:tcMar>
+          </w:tcPr>
+          <w:p>
+            <w:pPr>
+              <w:spacing w:after="0" w:line="240"/>
+            </w:pPr>
+            <w:r>
+              <w:rPr>
+                <w:rFonts w:ascii="Calibri" w:cs="Calibri" w:eastAsia="Calibri" w:hAnsi="Calibri"/>
+                <w:b w:val="false"/>
+                <w:bCs w:val="false"/>
+                <w:color w:val="22303F"/>
+                <w:sz w:val="18"/>
+                <w:szCs w:val="18"/>
+              </w:rPr>
+              <w:t xml:space="preserve"/>
+            </w:r>
+          </w:p>
+        </w:tc>
+        <w:tc>
+          <w:tcPr>
+            <w:tcW w:type="dxa" w:w="2100"/>
+            <w:shd w:fill="F1F4F9" w:color="auto" w:val="clear"/>
+            <w:tcMar>
+              <w:top w:type="dxa" w:w="40"/>
+              <w:left w:type="dxa" w:w="70"/>
+              <w:bottom w:type="dxa" w:w="40"/>
+              <w:right w:type="dxa" w:w="70"/>
+            </w:tcMar>
+          </w:tcPr>
+          <w:p>
+            <w:pPr>
+              <w:spacing w:after="0" w:line="240"/>
+            </w:pPr>
+            <w:r>
+              <w:rPr>
+                <w:rFonts w:ascii="Calibri" w:cs="Calibri" w:eastAsia="Calibri" w:hAnsi="Calibri"/>
+                <w:b w:val="false"/>
+                <w:bCs w:val="false"/>
+                <w:color w:val="22303F"/>
+                <w:sz w:val="18"/>
+                <w:szCs w:val="18"/>
+              </w:rPr>
+              <w:t xml:space="preserve">Recipient count, error or skip reason</w:t>
+            </w:r>
+          </w:p>
+        </w:tc>
+      </w:tr>
+    </w:tbl>
+    <w:p>
+      <w:pPr>
+        <w:pStyle w:val="Heading1"/>
+        <w:spacing w:after="120" w:before="260"/>
+      </w:pPr>
+      <w:r>
+        <w:rPr>
+          <w:rFonts w:ascii="Calibri" w:cs="Calibri" w:eastAsia="Calibri" w:hAnsi="Calibri"/>
+          <w:b/>
+          <w:bCs/>
+          <w:color w:val="0B2545"/>
+          <w:sz w:val="30"/>
+          <w:szCs w:val="30"/>
+        </w:rPr>
+        <w:t xml:space="preserve">5. Relationships Summary</w:t>
       </w:r>
     </w:p>
     <w:p>
@@ -9095,19 +11740,20 @@
     </w:p>
     <w:p>
       <w:pPr>
-        <w:pStyle w:val="Heading1"/>
-        <w:spacing w:after="120" w:before="260"/>
+        <w:pStyle w:val="ListParagraph"/>
+        <w:numPr>
+          <w:ilvl w:val="0"/>
+          <w:numId w:val="2"/>
+        </w:numPr>
+        <w:spacing w:after="60" w:line="264"/>
       </w:pPr>
       <w:r>
         <w:rPr>
           <w:rFonts w:ascii="Calibri" w:cs="Calibri" w:eastAsia="Calibri" w:hAnsi="Calibri"/>
-          <w:b/>
-          <w:bCs/>
-          <w:color w:val="0B2545"/>
-          <w:sz w:val="30"/>
-          <w:szCs w:val="30"/>
+          <w:sz w:val="21"/>
+          <w:szCs w:val="21"/>
         </w:rPr>
-        <w:t xml:space="preserve">5. Indexes &amp; Integrity Notes</w:t>
+        <w:t xml:space="preserve">User ⇄ NotificationGroup many-to-many (NotificationGroupUsers, both FKs cascade).</w:t>
       </w:r>
     </w:p>
     <w:p>
@@ -9125,7 +11771,60 @@
           <w:sz w:val="21"/>
           <w:szCs w:val="21"/>
         </w:rPr>
-        <w:t xml:space="preserve">Unique indexes: BusinessUnit.Code, User.Email, LookupValue(Category, Code), SupplierFieldSetting.FieldKey, SupplierTabSetting.Step, SupplierAccessToken.TokenHash.</w:t>
+        <w:t xml:space="preserve">NotificationGroup 1—* ScheduledReport (NotificationGroupId, required, cascade).</w:t>
+      </w:r>
+    </w:p>
+    <w:p>
+      <w:pPr>
+        <w:pStyle w:val="Heading1"/>
+        <w:spacing w:after="120" w:before="260"/>
+      </w:pPr>
+      <w:r>
+        <w:rPr>
+          <w:rFonts w:ascii="Calibri" w:cs="Calibri" w:eastAsia="Calibri" w:hAnsi="Calibri"/>
+          <w:b/>
+          <w:bCs/>
+          <w:color w:val="0B2545"/>
+          <w:sz w:val="30"/>
+          <w:szCs w:val="30"/>
+        </w:rPr>
+        <w:t xml:space="preserve">6. Indexes &amp; Integrity Notes</w:t>
+      </w:r>
+    </w:p>
+    <w:p>
+      <w:pPr>
+        <w:pStyle w:val="ListParagraph"/>
+        <w:numPr>
+          <w:ilvl w:val="0"/>
+          <w:numId w:val="2"/>
+        </w:numPr>
+        <w:spacing w:after="60" w:line="264"/>
+      </w:pPr>
+      <w:r>
+        <w:rPr>
+          <w:rFonts w:ascii="Calibri" w:cs="Calibri" w:eastAsia="Calibri" w:hAnsi="Calibri"/>
+          <w:sz w:val="21"/>
+          <w:szCs w:val="21"/>
+        </w:rPr>
+        <w:t xml:space="preserve">Unique indexes: BusinessUnit.Code, User.Email, LookupValue(Category, Code), SupplierFieldSetting.FieldKey, SupplierTabSetting.Step, SupplierAccessToken.TokenHash, NotificationGroup.Name.</w:t>
+      </w:r>
+    </w:p>
+    <w:p>
+      <w:pPr>
+        <w:pStyle w:val="ListParagraph"/>
+        <w:numPr>
+          <w:ilvl w:val="0"/>
+          <w:numId w:val="2"/>
+        </w:numPr>
+        <w:spacing w:after="60" w:line="264"/>
+      </w:pPr>
+      <w:r>
+        <w:rPr>
+          <w:rFonts w:ascii="Calibri" w:cs="Calibri" w:eastAsia="Calibri" w:hAnsi="Calibri"/>
+          <w:sz w:val="21"/>
+          <w:szCs w:val="21"/>
+        </w:rPr>
+        <w:t xml:space="preserve">Non-unique indexes: NotificationGroupUsers.UserId, ScheduledReport.NotificationGroupId.</w:t>
       </w:r>
     </w:p>
     <w:p>

</xml_diff>